<commit_message>
Update OSTrails test results table for 1,16,32
</commit_message>
<xml_diff>
--- a/docs/final_report_20260622.docx
+++ b/docs/final_report_20260622.docx
@@ -2,8 +2,8 @@
 <file path=word/document.xml><?xml version="1.0" encoding="utf-8"?>
 <w:document xmlns:wpc="http://schemas.microsoft.com/office/word/2010/wordprocessingCanvas" xmlns:cx="http://schemas.microsoft.com/office/drawing/2014/chartex" xmlns:cx1="http://schemas.microsoft.com/office/drawing/2015/9/8/chartex" xmlns:cx2="http://schemas.microsoft.com/office/drawing/2015/10/21/chartex" xmlns:cx3="http://schemas.microsoft.com/office/drawing/2016/5/9/chartex" xmlns:cx4="http://schemas.microsoft.com/office/drawing/2016/5/10/chartex" xmlns:cx5="http://schemas.microsoft.com/office/drawing/2016/5/11/chartex" xmlns:cx6="http://schemas.microsoft.com/office/drawing/2016/5/12/chartex" xmlns:cx7="http://schemas.microsoft.com/office/drawing/2016/5/13/chartex" xmlns:cx8="http://schemas.microsoft.com/office/drawing/2016/5/14/chartex" xmlns:mc="http://schemas.openxmlformats.org/markup-compatibility/2006" xmlns:aink="http://schemas.microsoft.com/office/drawing/2016/ink" xmlns:am3d="http://schemas.microsoft.com/office/drawing/2017/model3d" xmlns:o="urn:schemas-microsoft-com:office:office" xmlns:oel="http://schemas.microsoft.com/office/2019/extlst" xmlns:r="http://schemas.openxmlformats.org/officeDocument/2006/relationships" xmlns:m="http://schemas.openxmlformats.org/officeDocument/2006/math" xmlns:v="urn:schemas-microsoft-com:vml" xmlns:wp14="http://schemas.microsoft.com/office/word/2010/wordprocessingDrawing" xmlns:wp="http://schemas.openxmlformats.org/drawingml/2006/wordprocessingDrawing" xmlns:w10="urn:schemas-microsoft-com:office:word" xmlns:w="http://schemas.openxmlformats.org/wordprocessingml/2006/main" xmlns:w14="http://schemas.microsoft.com/office/word/2010/wordml" xmlns:w15="http://schemas.microsoft.com/office/word/2012/wordml" xmlns:w16cex="http://schemas.microsoft.com/office/word/2018/wordml/cex" xmlns:w16cid="http://schemas.microsoft.com/office/word/2016/wordml/cid" xmlns:w16="http://schemas.microsoft.com/office/word/2018/wordml" xmlns:w16du="http://schemas.microsoft.com/office/word/2023/wordml/word16du" xmlns:w16sdtdh="http://schemas.microsoft.com/office/word/2020/wordml/sdtdatahash" xmlns:w16sdtfl="http://schemas.microsoft.com/office/word/2024/wordml/sdtformatlock" xmlns:w16se="http://schemas.microsoft.com/office/word/2015/wordml/symex" xmlns:wpg="http://schemas.microsoft.com/office/word/2010/wordprocessingGroup" xmlns:wpi="http://schemas.microsoft.com/office/word/2010/wordprocessingInk" xmlns:wne="http://schemas.microsoft.com/office/word/2006/wordml" xmlns:wps="http://schemas.microsoft.com/office/word/2010/wordprocessingShape" mc:Ignorable="w14 w15 w16se w16cid w16 w16cex w16sdtdh w16sdtfl w16du wp14">
   <w:body>
+    <w:bookmarkStart w:id="0" w:name="_Toc233029879"/>
     <w:p>
-      <w:bookmarkStart w:id="0" w:name="_Toc233029879"/>
       <w:r>
         <w:rPr>
           <w:noProof/>
@@ -1969,6 +1969,9 @@
               <w:jc w:val="center"/>
               <w:cnfStyle w:val="000000100000" w:firstRow="0" w:lastRow="0" w:firstColumn="0" w:lastColumn="0" w:oddVBand="0" w:evenVBand="0" w:oddHBand="1" w:evenHBand="0" w:firstRowFirstColumn="0" w:firstRowLastColumn="0" w:lastRowFirstColumn="0" w:lastRowLastColumn="0"/>
             </w:pPr>
+            <w:r>
+              <w:t>F</w:t>
+            </w:r>
           </w:p>
         </w:tc>
         <w:tc>
@@ -1980,6 +1983,9 @@
               <w:jc w:val="center"/>
               <w:cnfStyle w:val="000000100000" w:firstRow="0" w:lastRow="0" w:firstColumn="0" w:lastColumn="0" w:oddVBand="0" w:evenVBand="0" w:oddHBand="1" w:evenHBand="0" w:firstRowFirstColumn="0" w:firstRowLastColumn="0" w:lastRowFirstColumn="0" w:lastRowLastColumn="0"/>
             </w:pPr>
+            <w:r>
+              <w:t>fail</w:t>
+            </w:r>
           </w:p>
         </w:tc>
         <w:tc>
@@ -1989,7 +1995,30 @@
           <w:p>
             <w:pPr>
               <w:cnfStyle w:val="000000100000" w:firstRow="0" w:lastRow="0" w:firstColumn="0" w:lastColumn="0" w:oddVBand="0" w:evenVBand="0" w:oddHBand="1" w:evenHBand="0" w:firstRowFirstColumn="0" w:firstRowLastColumn="0" w:lastRowFirstColumn="0" w:lastRowLastColumn="0"/>
-            </w:pPr>
+              <w:rPr>
+                <w:lang w:val="en-IN"/>
+              </w:rPr>
+            </w:pPr>
+            <w:r>
+              <w:rPr>
+                <w:lang w:val="en-IN"/>
+              </w:rPr>
+              <w:t xml:space="preserve">No dataset entry declares the </w:t>
+            </w:r>
+            <w:proofErr w:type="spellStart"/>
+            <w:r>
+              <w:rPr>
+                <w:lang w:val="en-IN"/>
+              </w:rPr>
+              <w:t>is_reused</w:t>
+            </w:r>
+            <w:proofErr w:type="spellEnd"/>
+            <w:r>
+              <w:rPr>
+                <w:lang w:val="en-IN"/>
+              </w:rPr>
+              <w:t xml:space="preserve"> field.</w:t>
+            </w:r>
           </w:p>
         </w:tc>
       </w:tr>
@@ -2153,30 +2182,58 @@
           </w:tcPr>
           <w:p>
             <w:pPr>
+              <w:cnfStyle w:val="000000000000" w:firstRow="0" w:lastRow="0" w:firstColumn="0" w:lastColumn="0" w:oddVBand="0" w:evenVBand="0" w:oddHBand="0" w:evenHBand="0" w:firstRowFirstColumn="0" w:firstRowLastColumn="0" w:lastRowFirstColumn="0" w:lastRowLastColumn="0"/>
+            </w:pPr>
+            <w:r>
+              <w:t xml:space="preserve">               F</w:t>
+            </w:r>
+          </w:p>
+        </w:tc>
+        <w:tc>
+          <w:tcPr>
+            <w:tcW w:w="1316" w:type="dxa"/>
+          </w:tcPr>
+          <w:p>
+            <w:pPr>
               <w:jc w:val="center"/>
               <w:cnfStyle w:val="000000000000" w:firstRow="0" w:lastRow="0" w:firstColumn="0" w:lastColumn="0" w:oddVBand="0" w:evenVBand="0" w:oddHBand="0" w:evenHBand="0" w:firstRowFirstColumn="0" w:firstRowLastColumn="0" w:lastRowFirstColumn="0" w:lastRowLastColumn="0"/>
             </w:pPr>
-          </w:p>
-        </w:tc>
-        <w:tc>
-          <w:tcPr>
-            <w:tcW w:w="1316" w:type="dxa"/>
-          </w:tcPr>
-          <w:p>
-            <w:pPr>
-              <w:jc w:val="center"/>
+            <w:r>
+              <w:t>pass</w:t>
+            </w:r>
+          </w:p>
+        </w:tc>
+        <w:tc>
+          <w:tcPr>
+            <w:tcW w:w="4110" w:type="dxa"/>
+          </w:tcPr>
+          <w:p>
+            <w:pPr>
               <w:cnfStyle w:val="000000000000" w:firstRow="0" w:lastRow="0" w:firstColumn="0" w:lastColumn="0" w:oddVBand="0" w:evenVBand="0" w:oddHBand="0" w:evenHBand="0" w:firstRowFirstColumn="0" w:firstRowLastColumn="0" w:lastRowFirstColumn="0" w:lastRowLastColumn="0"/>
-            </w:pPr>
-          </w:p>
-        </w:tc>
-        <w:tc>
-          <w:tcPr>
-            <w:tcW w:w="4110" w:type="dxa"/>
-          </w:tcPr>
-          <w:p>
-            <w:pPr>
-              <w:cnfStyle w:val="000000000000" w:firstRow="0" w:lastRow="0" w:firstColumn="0" w:lastColumn="0" w:oddVBand="0" w:evenVBand="0" w:oddHBand="0" w:evenHBand="0" w:firstRowFirstColumn="0" w:firstRowLastColumn="0" w:lastRowFirstColumn="0" w:lastRowLastColumn="0"/>
-            </w:pPr>
+              <w:rPr>
+                <w:lang w:val="en-IN"/>
+              </w:rPr>
+            </w:pPr>
+            <w:r>
+              <w:rPr>
+                <w:lang w:val="en-IN"/>
+              </w:rPr>
+              <w:t xml:space="preserve">At least one dataset does not contain the </w:t>
+            </w:r>
+            <w:proofErr w:type="spellStart"/>
+            <w:r>
+              <w:rPr>
+                <w:lang w:val="en-IN"/>
+              </w:rPr>
+              <w:t>is_reused</w:t>
+            </w:r>
+            <w:proofErr w:type="spellEnd"/>
+            <w:r>
+              <w:rPr>
+                <w:lang w:val="en-IN"/>
+              </w:rPr>
+              <w:t xml:space="preserve"> field, indicating new data.</w:t>
+            </w:r>
           </w:p>
         </w:tc>
       </w:tr>
@@ -2337,6 +2394,9 @@
               <w:jc w:val="center"/>
               <w:cnfStyle w:val="000000100000" w:firstRow="0" w:lastRow="0" w:firstColumn="0" w:lastColumn="0" w:oddVBand="0" w:evenVBand="0" w:oddHBand="1" w:evenHBand="0" w:firstRowFirstColumn="0" w:firstRowLastColumn="0" w:lastRowFirstColumn="0" w:lastRowLastColumn="0"/>
             </w:pPr>
+            <w:r>
+              <w:t>I</w:t>
+            </w:r>
           </w:p>
         </w:tc>
         <w:tc>
@@ -2348,6 +2408,9 @@
               <w:jc w:val="center"/>
               <w:cnfStyle w:val="000000100000" w:firstRow="0" w:lastRow="0" w:firstColumn="0" w:lastColumn="0" w:oddVBand="0" w:evenVBand="0" w:oddHBand="1" w:evenHBand="0" w:firstRowFirstColumn="0" w:firstRowLastColumn="0" w:lastRowFirstColumn="0" w:lastRowLastColumn="0"/>
             </w:pPr>
+            <w:r>
+              <w:t>pass</w:t>
+            </w:r>
           </w:p>
         </w:tc>
         <w:tc>
@@ -2357,7 +2420,56 @@
           <w:p>
             <w:pPr>
               <w:cnfStyle w:val="000000100000" w:firstRow="0" w:lastRow="0" w:firstColumn="0" w:lastColumn="0" w:oddVBand="0" w:evenVBand="0" w:oddHBand="1" w:evenHBand="0" w:firstRowFirstColumn="0" w:firstRowLastColumn="0" w:lastRowFirstColumn="0" w:lastRowLastColumn="0"/>
-            </w:pPr>
+              <w:rPr>
+                <w:lang w:val="en-IN"/>
+              </w:rPr>
+            </w:pPr>
+            <w:proofErr w:type="spellStart"/>
+            <w:proofErr w:type="gramStart"/>
+            <w:r>
+              <w:rPr>
+                <w:lang w:val="en-IN"/>
+              </w:rPr>
+              <w:t>dmp.title</w:t>
+            </w:r>
+            <w:proofErr w:type="spellEnd"/>
+            <w:proofErr w:type="gramEnd"/>
+            <w:r>
+              <w:rPr>
+                <w:lang w:val="en-IN"/>
+              </w:rPr>
+              <w:t xml:space="preserve">, </w:t>
+            </w:r>
+            <w:proofErr w:type="spellStart"/>
+            <w:proofErr w:type="gramStart"/>
+            <w:r>
+              <w:rPr>
+                <w:lang w:val="en-IN"/>
+              </w:rPr>
+              <w:t>dmp.created</w:t>
+            </w:r>
+            <w:proofErr w:type="spellEnd"/>
+            <w:proofErr w:type="gramEnd"/>
+            <w:r>
+              <w:rPr>
+                <w:lang w:val="en-IN"/>
+              </w:rPr>
+              <w:t xml:space="preserve">, and </w:t>
+            </w:r>
+            <w:proofErr w:type="spellStart"/>
+            <w:r>
+              <w:rPr>
+                <w:lang w:val="en-IN"/>
+              </w:rPr>
+              <w:t>dmp.dmp_id</w:t>
+            </w:r>
+            <w:proofErr w:type="spellEnd"/>
+            <w:r>
+              <w:rPr>
+                <w:lang w:val="en-IN"/>
+              </w:rPr>
+              <w:t xml:space="preserve"> are all present.</w:t>
+            </w:r>
           </w:p>
         </w:tc>
       </w:tr>
@@ -5216,44 +5328,16 @@
                 <w:lang w:val="en-GB"/>
               </w:rPr>
             </w:pPr>
-            <w:r>
-              <w:rPr>
-                <w:color w:val="000000" w:themeColor="text1"/>
-              </w:rPr>
-              <w:fldChar w:fldCharType="begin"/>
-            </w:r>
-            <w:r>
-              <w:rPr>
-                <w:color w:val="000000" w:themeColor="text1"/>
-                <w:lang w:val="en-IN"/>
-              </w:rPr>
-              <w:instrText>HYPERLINK "https://github.com/e12436439/Data-Stewardship-UE-2026S/releases"</w:instrText>
-            </w:r>
-            <w:r>
-              <w:rPr>
-                <w:color w:val="000000" w:themeColor="text1"/>
-              </w:rPr>
-            </w:r>
-            <w:r>
-              <w:rPr>
-                <w:color w:val="000000" w:themeColor="text1"/>
-              </w:rPr>
-              <w:fldChar w:fldCharType="separate"/>
-            </w:r>
-            <w:r>
-              <w:rPr>
-                <w:rStyle w:val="Hyperlink"/>
-                <w:color w:val="000000" w:themeColor="text1"/>
-                <w:lang w:val="en-GB"/>
-              </w:rPr>
-              <w:t>https://github.com/e12436439/Data-Stewardship-UE-2026S/releases/tag/Part3</w:t>
-            </w:r>
-            <w:r>
-              <w:rPr>
-                <w:color w:val="000000" w:themeColor="text1"/>
-              </w:rPr>
-              <w:fldChar w:fldCharType="end"/>
-            </w:r>
+            <w:hyperlink r:id="rId11" w:history="1">
+              <w:r>
+                <w:rPr>
+                  <w:rStyle w:val="Hyperlink"/>
+                  <w:color w:val="000000" w:themeColor="text1"/>
+                  <w:lang w:val="en-GB"/>
+                </w:rPr>
+                <w:t>https://github.com/e12436439/Data-Stewardship-UE-2026S/releases/tag/Part3</w:t>
+              </w:r>
+            </w:hyperlink>
           </w:p>
         </w:tc>
         <w:tc>
@@ -6892,7 +6976,7 @@
       </w:pPr>
     </w:p>
     <w:sectPr>
-      <w:headerReference w:type="default" r:id="rId11"/>
+      <w:headerReference w:type="default" r:id="rId12"/>
       <w:pgSz w:w="11906" w:h="16838"/>
       <w:pgMar w:top="1417" w:right="1417" w:bottom="1134" w:left="1417" w:header="708" w:footer="708" w:gutter="0"/>
       <w:cols w:space="708"/>
@@ -7564,7 +7648,6 @@
   <w:style w:type="character" w:default="1" w:styleId="DefaultParagraphFont">
     <w:name w:val="Default Paragraph Font"/>
     <w:uiPriority w:val="1"/>
-    <w:semiHidden/>
     <w:unhideWhenUsed/>
   </w:style>
   <w:style w:type="table" w:default="1" w:styleId="TableNormal">

</xml_diff>

<commit_message>
Update Owner D final report sign-off tables
</commit_message>
<xml_diff>
--- a/docs/final_report_20260622.docx
+++ b/docs/final_report_20260622.docx
@@ -1,6 +1,6 @@
 
 <file path=word/document.xml><?xml version="1.0" encoding="utf-8"?>
-<w:document xmlns:wpc="http://schemas.microsoft.com/office/word/2010/wordprocessingCanvas" xmlns:cx="http://schemas.microsoft.com/office/drawing/2014/chartex" xmlns:cx1="http://schemas.microsoft.com/office/drawing/2015/9/8/chartex" xmlns:cx2="http://schemas.microsoft.com/office/drawing/2015/10/21/chartex" xmlns:cx3="http://schemas.microsoft.com/office/drawing/2016/5/9/chartex" xmlns:cx4="http://schemas.microsoft.com/office/drawing/2016/5/10/chartex" xmlns:cx5="http://schemas.microsoft.com/office/drawing/2016/5/11/chartex" xmlns:cx6="http://schemas.microsoft.com/office/drawing/2016/5/12/chartex" xmlns:cx7="http://schemas.microsoft.com/office/drawing/2016/5/13/chartex" xmlns:cx8="http://schemas.microsoft.com/office/drawing/2016/5/14/chartex" xmlns:mc="http://schemas.openxmlformats.org/markup-compatibility/2006" xmlns:aink="http://schemas.microsoft.com/office/drawing/2016/ink" xmlns:am3d="http://schemas.microsoft.com/office/drawing/2017/model3d" xmlns:o="urn:schemas-microsoft-com:office:office" xmlns:oel="http://schemas.microsoft.com/office/2019/extlst" xmlns:r="http://schemas.openxmlformats.org/officeDocument/2006/relationships" xmlns:m="http://schemas.openxmlformats.org/officeDocument/2006/math" xmlns:v="urn:schemas-microsoft-com:vml" xmlns:wp14="http://schemas.microsoft.com/office/word/2010/wordprocessingDrawing" xmlns:wp="http://schemas.openxmlformats.org/drawingml/2006/wordprocessingDrawing" xmlns:w10="urn:schemas-microsoft-com:office:word" xmlns:w="http://schemas.openxmlformats.org/wordprocessingml/2006/main" xmlns:w14="http://schemas.microsoft.com/office/word/2010/wordml" xmlns:w15="http://schemas.microsoft.com/office/word/2012/wordml" xmlns:w16cex="http://schemas.microsoft.com/office/word/2018/wordml/cex" xmlns:w16cid="http://schemas.microsoft.com/office/word/2016/wordml/cid" xmlns:w16="http://schemas.microsoft.com/office/word/2018/wordml" xmlns:w16du="http://schemas.microsoft.com/office/word/2023/wordml/word16du" xmlns:w16sdtdh="http://schemas.microsoft.com/office/word/2020/wordml/sdtdatahash" xmlns:w16se="http://schemas.microsoft.com/office/word/2015/wordml/symex" xmlns:wpg="http://schemas.microsoft.com/office/word/2010/wordprocessingGroup" xmlns:wpi="http://schemas.microsoft.com/office/word/2010/wordprocessingInk" xmlns:wne="http://schemas.microsoft.com/office/word/2006/wordml" xmlns:wps="http://schemas.microsoft.com/office/word/2010/wordprocessingShape" mc:Ignorable="w14 w15 w16se w16cid w16 w16cex w16sdtdh w16du wp14">
+<w:document xmlns:wpc="http://schemas.microsoft.com/office/word/2010/wordprocessingCanvas" xmlns:cx="http://schemas.microsoft.com/office/drawing/2014/chartex" xmlns:cx1="http://schemas.microsoft.com/office/drawing/2015/9/8/chartex" xmlns:cx2="http://schemas.microsoft.com/office/drawing/2015/10/21/chartex" xmlns:cx3="http://schemas.microsoft.com/office/drawing/2016/5/9/chartex" xmlns:cx4="http://schemas.microsoft.com/office/drawing/2016/5/10/chartex" xmlns:cx5="http://schemas.microsoft.com/office/drawing/2016/5/11/chartex" xmlns:cx6="http://schemas.microsoft.com/office/drawing/2016/5/12/chartex" xmlns:cx7="http://schemas.microsoft.com/office/drawing/2016/5/13/chartex" xmlns:cx8="http://schemas.microsoft.com/office/drawing/2016/5/14/chartex" xmlns:mc="http://schemas.openxmlformats.org/markup-compatibility/2006" xmlns:aink="http://schemas.microsoft.com/office/drawing/2016/ink" xmlns:am3d="http://schemas.microsoft.com/office/drawing/2017/model3d" xmlns:o="urn:schemas-microsoft-com:office:office" xmlns:oel="http://schemas.microsoft.com/office/2019/extlst" xmlns:r="http://schemas.openxmlformats.org/officeDocument/2006/relationships" xmlns:m="http://schemas.openxmlformats.org/officeDocument/2006/math" xmlns:v="urn:schemas-microsoft-com:vml" xmlns:wp14="http://schemas.microsoft.com/office/word/2010/wordprocessingDrawing" xmlns:wp="http://schemas.openxmlformats.org/drawingml/2006/wordprocessingDrawing" xmlns:w10="urn:schemas-microsoft-com:office:word" xmlns:w="http://schemas.openxmlformats.org/wordprocessingml/2006/main" xmlns:w14="http://schemas.microsoft.com/office/word/2010/wordml" xmlns:w15="http://schemas.microsoft.com/office/word/2012/wordml" xmlns:w16cex="http://schemas.microsoft.com/office/word/2018/wordml/cex" xmlns:w16cid="http://schemas.microsoft.com/office/word/2016/wordml/cid" xmlns:w16="http://schemas.microsoft.com/office/word/2018/wordml" xmlns:w16du="http://schemas.microsoft.com/office/word/2023/wordml/word16du" xmlns:w16sdtdh="http://schemas.microsoft.com/office/word/2020/wordml/sdtdatahash" xmlns:w16sdtfl="http://schemas.microsoft.com/office/word/2024/wordml/sdtformatlock" xmlns:w16se="http://schemas.microsoft.com/office/word/2015/wordml/symex" xmlns:wpg="http://schemas.microsoft.com/office/word/2010/wordprocessingGroup" xmlns:wpi="http://schemas.microsoft.com/office/word/2010/wordprocessingInk" xmlns:wne="http://schemas.microsoft.com/office/word/2006/wordml" xmlns:wps="http://schemas.microsoft.com/office/word/2010/wordprocessingShape" mc:Ignorable="w14 w15 w16se w16cid w16 w16cex w16sdtdh w16sdtfl w16du wp14">
   <w:body>
     <w:p>
       <w:bookmarkStart w:id="0" w:name="_Toc233029879"/>
@@ -163,23 +163,13 @@
                                 <w:lang w:val="en-GB"/>
                               </w:rPr>
                             </w:pPr>
-                            <w:proofErr w:type="spellStart"/>
                             <w:r>
                               <w:rPr>
                                 <w:sz w:val="28"/>
                                 <w:szCs w:val="28"/>
                                 <w:lang w:val="en-GB"/>
                               </w:rPr>
-                              <w:t>Kiassa</w:t>
-                            </w:r>
-                            <w:proofErr w:type="spellEnd"/>
-                            <w:r>
-                              <w:rPr>
-                                <w:sz w:val="28"/>
-                                <w:szCs w:val="28"/>
-                                <w:lang w:val="en-GB"/>
-                              </w:rPr>
-                              <w:t xml:space="preserve"> Samy (0000-0003-2580-979X)</w:t>
+                              <w:t>Kiassa Samy (0000-0003-2580-979X)</w:t>
                             </w:r>
                             <w:r>
                               <w:rPr>
@@ -188,25 +178,7 @@
                                 <w:lang w:val="en-GB"/>
                               </w:rPr>
                               <w:br/>
-                              <w:t xml:space="preserve">Adigun Oladapo </w:t>
-                            </w:r>
-                            <w:proofErr w:type="spellStart"/>
-                            <w:r>
-                              <w:rPr>
-                                <w:sz w:val="28"/>
-                                <w:szCs w:val="28"/>
-                                <w:lang w:val="en-GB"/>
-                              </w:rPr>
-                              <w:t>Oludele</w:t>
-                            </w:r>
-                            <w:proofErr w:type="spellEnd"/>
-                            <w:r>
-                              <w:rPr>
-                                <w:sz w:val="28"/>
-                                <w:szCs w:val="28"/>
-                                <w:lang w:val="en-GB"/>
-                              </w:rPr>
-                              <w:t xml:space="preserve"> (0009-0001-7256-5903)</w:t>
+                              <w:t>Adigun Oladapo Oludele (0009-0001-7256-5903)</w:t>
                             </w:r>
                             <w:r>
                               <w:rPr>
@@ -231,37 +203,12 @@
                               </w:rPr>
                               <w:br/>
                             </w:r>
-                            <w:proofErr w:type="spellStart"/>
                             <w:r>
                               <w:rPr>
                                 <w:sz w:val="28"/>
                                 <w:szCs w:val="28"/>
                               </w:rPr>
-                              <w:t>Muskan</w:t>
-                            </w:r>
-                            <w:proofErr w:type="spellEnd"/>
-                            <w:r>
-                              <w:rPr>
-                                <w:sz w:val="28"/>
-                                <w:szCs w:val="28"/>
-                              </w:rPr>
-                              <w:t xml:space="preserve"> </w:t>
-                            </w:r>
-                            <w:proofErr w:type="spellStart"/>
-                            <w:r>
-                              <w:rPr>
-                                <w:sz w:val="28"/>
-                                <w:szCs w:val="28"/>
-                              </w:rPr>
-                              <w:t>Sodhi</w:t>
-                            </w:r>
-                            <w:proofErr w:type="spellEnd"/>
-                            <w:r>
-                              <w:rPr>
-                                <w:sz w:val="28"/>
-                                <w:szCs w:val="28"/>
-                              </w:rPr>
-                              <w:t xml:space="preserve"> (0009-0004-8744-9106)</w:t>
+                              <w:t>Muskan Sodhi (0009-0004-8744-9106)</w:t>
                             </w:r>
                           </w:p>
                           <w:p>
@@ -308,23 +255,13 @@
                           <w:lang w:val="en-GB"/>
                         </w:rPr>
                       </w:pPr>
-                      <w:proofErr w:type="spellStart"/>
                       <w:r>
                         <w:rPr>
                           <w:sz w:val="28"/>
                           <w:szCs w:val="28"/>
                           <w:lang w:val="en-GB"/>
                         </w:rPr>
-                        <w:t>Kiassa</w:t>
-                      </w:r>
-                      <w:proofErr w:type="spellEnd"/>
-                      <w:r>
-                        <w:rPr>
-                          <w:sz w:val="28"/>
-                          <w:szCs w:val="28"/>
-                          <w:lang w:val="en-GB"/>
-                        </w:rPr>
-                        <w:t xml:space="preserve"> Samy (0000-0003-2580-979X)</w:t>
+                        <w:t>Kiassa Samy (0000-0003-2580-979X)</w:t>
                       </w:r>
                       <w:r>
                         <w:rPr>
@@ -333,25 +270,7 @@
                           <w:lang w:val="en-GB"/>
                         </w:rPr>
                         <w:br/>
-                        <w:t xml:space="preserve">Adigun Oladapo </w:t>
-                      </w:r>
-                      <w:proofErr w:type="spellStart"/>
-                      <w:r>
-                        <w:rPr>
-                          <w:sz w:val="28"/>
-                          <w:szCs w:val="28"/>
-                          <w:lang w:val="en-GB"/>
-                        </w:rPr>
-                        <w:t>Oludele</w:t>
-                      </w:r>
-                      <w:proofErr w:type="spellEnd"/>
-                      <w:r>
-                        <w:rPr>
-                          <w:sz w:val="28"/>
-                          <w:szCs w:val="28"/>
-                          <w:lang w:val="en-GB"/>
-                        </w:rPr>
-                        <w:t xml:space="preserve"> (0009-0001-7256-5903)</w:t>
+                        <w:t>Adigun Oladapo Oludele (0009-0001-7256-5903)</w:t>
                       </w:r>
                       <w:r>
                         <w:rPr>
@@ -376,37 +295,12 @@
                         </w:rPr>
                         <w:br/>
                       </w:r>
-                      <w:proofErr w:type="spellStart"/>
                       <w:r>
                         <w:rPr>
                           <w:sz w:val="28"/>
                           <w:szCs w:val="28"/>
                         </w:rPr>
-                        <w:t>Muskan</w:t>
-                      </w:r>
-                      <w:proofErr w:type="spellEnd"/>
-                      <w:r>
-                        <w:rPr>
-                          <w:sz w:val="28"/>
-                          <w:szCs w:val="28"/>
-                        </w:rPr>
-                        <w:t xml:space="preserve"> </w:t>
-                      </w:r>
-                      <w:proofErr w:type="spellStart"/>
-                      <w:r>
-                        <w:rPr>
-                          <w:sz w:val="28"/>
-                          <w:szCs w:val="28"/>
-                        </w:rPr>
-                        <w:t>Sodhi</w:t>
-                      </w:r>
-                      <w:proofErr w:type="spellEnd"/>
-                      <w:r>
-                        <w:rPr>
-                          <w:sz w:val="28"/>
-                          <w:szCs w:val="28"/>
-                        </w:rPr>
-                        <w:t xml:space="preserve"> (0009-0004-8744-9106)</w:t>
+                        <w:t>Muskan Sodhi (0009-0004-8744-9106)</w:t>
                       </w:r>
                     </w:p>
                     <w:p>
@@ -530,7 +424,7 @@
                         <w:txbxContent>
                           <w:p>
                             <w:pPr>
-                              <w:pStyle w:val="Listenabsatz"/>
+                              <w:pStyle w:val="ListParagraph"/>
                               <w:rPr>
                                 <w:sz w:val="24"/>
                                 <w:szCs w:val="24"/>
@@ -573,7 +467,7 @@
                   <w:txbxContent>
                     <w:p>
                       <w:pPr>
-                        <w:pStyle w:val="Listenabsatz"/>
+                        <w:pStyle w:val="ListParagraph"/>
                         <w:rPr>
                           <w:sz w:val="24"/>
                           <w:szCs w:val="24"/>
@@ -637,7 +531,7 @@
                         <w:txbxContent>
                           <w:p>
                             <w:pPr>
-                              <w:pStyle w:val="Listenabsatz"/>
+                              <w:pStyle w:val="ListParagraph"/>
                               <w:rPr>
                                 <w:sz w:val="32"/>
                                 <w:szCs w:val="32"/>
@@ -680,7 +574,7 @@
                   <w:txbxContent>
                     <w:p>
                       <w:pPr>
-                        <w:pStyle w:val="Listenabsatz"/>
+                        <w:pStyle w:val="ListParagraph"/>
                         <w:rPr>
                           <w:sz w:val="32"/>
                           <w:szCs w:val="32"/>
@@ -835,7 +729,7 @@
     </w:p>
     <w:p>
       <w:pPr>
-        <w:pStyle w:val="Inhaltsverzeichnisberschrift"/>
+        <w:pStyle w:val="TOCHeading"/>
       </w:pPr>
       <w:r>
         <w:br w:type="column"/>
@@ -844,7 +738,13 @@
     <w:sdt>
       <w:sdtPr>
         <w:rPr>
-          <w:lang w:val="de-DE"/>
+          <w:rFonts w:asciiTheme="minorHAnsi" w:eastAsiaTheme="minorHAnsi" w:hAnsiTheme="minorHAnsi" w:cstheme="minorBidi"/>
+          <w:color w:val="auto"/>
+          <w:kern w:val="2"/>
+          <w:sz w:val="22"/>
+          <w:szCs w:val="22"/>
+          <w:lang w:val="de-DE" w:eastAsia="en-US"/>
+          <w14:ligatures w14:val="standardContextual"/>
         </w:rPr>
         <w:id w:val="-1302227854"/>
         <w:docPartObj>
@@ -854,21 +754,14 @@
       </w:sdtPr>
       <w:sdtEndPr>
         <w:rPr>
-          <w:rFonts w:asciiTheme="minorHAnsi" w:eastAsiaTheme="minorHAnsi" w:hAnsiTheme="minorHAnsi" w:cstheme="minorBidi"/>
           <w:b/>
           <w:bCs/>
-          <w:color w:val="auto"/>
-          <w:kern w:val="2"/>
-          <w:sz w:val="22"/>
-          <w:szCs w:val="22"/>
-          <w:lang w:eastAsia="en-US"/>
-          <w14:ligatures w14:val="standardContextual"/>
         </w:rPr>
       </w:sdtEndPr>
       <w:sdtContent>
         <w:p>
           <w:pPr>
-            <w:pStyle w:val="Inhaltsverzeichnisberschrift"/>
+            <w:pStyle w:val="TOCHeading"/>
           </w:pPr>
           <w:r>
             <w:rPr>
@@ -879,7 +772,7 @@
         </w:p>
         <w:p>
           <w:pPr>
-            <w:pStyle w:val="Verzeichnis1"/>
+            <w:pStyle w:val="TOC1"/>
             <w:tabs>
               <w:tab w:val="right" w:leader="dot" w:pos="9062"/>
             </w:tabs>
@@ -958,7 +851,7 @@
         </w:p>
         <w:p>
           <w:pPr>
-            <w:pStyle w:val="Verzeichnis1"/>
+            <w:pStyle w:val="TOC1"/>
             <w:tabs>
               <w:tab w:val="right" w:leader="dot" w:pos="9062"/>
             </w:tabs>
@@ -1029,7 +922,7 @@
         </w:p>
         <w:p>
           <w:pPr>
-            <w:pStyle w:val="Verzeichnis1"/>
+            <w:pStyle w:val="TOC1"/>
             <w:tabs>
               <w:tab w:val="right" w:leader="dot" w:pos="9062"/>
             </w:tabs>
@@ -1100,7 +993,7 @@
         </w:p>
         <w:p>
           <w:pPr>
-            <w:pStyle w:val="Verzeichnis1"/>
+            <w:pStyle w:val="TOC1"/>
             <w:tabs>
               <w:tab w:val="right" w:leader="dot" w:pos="9062"/>
             </w:tabs>
@@ -1171,7 +1064,7 @@
         </w:p>
         <w:p>
           <w:pPr>
-            <w:pStyle w:val="Verzeichnis1"/>
+            <w:pStyle w:val="TOC1"/>
             <w:tabs>
               <w:tab w:val="right" w:leader="dot" w:pos="9062"/>
             </w:tabs>
@@ -1242,7 +1135,7 @@
         </w:p>
         <w:p>
           <w:pPr>
-            <w:pStyle w:val="Verzeichnis1"/>
+            <w:pStyle w:val="TOC1"/>
             <w:tabs>
               <w:tab w:val="right" w:leader="dot" w:pos="9062"/>
             </w:tabs>
@@ -1312,7 +1205,7 @@
         </w:p>
         <w:p>
           <w:pPr>
-            <w:pStyle w:val="Verzeichnis1"/>
+            <w:pStyle w:val="TOC1"/>
             <w:tabs>
               <w:tab w:val="right" w:leader="dot" w:pos="9062"/>
             </w:tabs>
@@ -1382,7 +1275,7 @@
         </w:p>
         <w:p>
           <w:pPr>
-            <w:pStyle w:val="Verzeichnis1"/>
+            <w:pStyle w:val="TOC1"/>
             <w:tabs>
               <w:tab w:val="right" w:leader="dot" w:pos="9062"/>
             </w:tabs>
@@ -1465,19 +1358,31 @@
     </w:sdt>
     <w:p>
       <w:pPr>
-        <w:pStyle w:val="berschrift1"/>
+        <w:pStyle w:val="Heading1"/>
+        <w:rPr>
+          <w:lang w:val="en-IN"/>
+        </w:rPr>
       </w:pPr>
       <w:r>
+        <w:rPr>
+          <w:lang w:val="en-IN"/>
+        </w:rPr>
         <w:br w:type="column"/>
       </w:r>
       <w:bookmarkStart w:id="2" w:name="_Toc233034886"/>
       <w:r>
+        <w:rPr>
+          <w:lang w:val="en-IN"/>
+        </w:rPr>
         <w:lastRenderedPageBreak/>
         <w:t>Abstract</w:t>
       </w:r>
       <w:bookmarkEnd w:id="1"/>
       <w:bookmarkEnd w:id="2"/>
       <w:r>
+        <w:rPr>
+          <w:lang w:val="en-IN"/>
+        </w:rPr>
         <w:br/>
       </w:r>
     </w:p>
@@ -1597,7 +1502,7 @@
     </w:p>
     <w:p>
       <w:pPr>
-        <w:pStyle w:val="berschrift1"/>
+        <w:pStyle w:val="Heading1"/>
         <w:rPr>
           <w:lang w:val="en-GB"/>
         </w:rPr>
@@ -1628,7 +1533,7 @@
     </w:p>
     <w:p>
       <w:pPr>
-        <w:pStyle w:val="StandardWeb"/>
+        <w:pStyle w:val="NormalWeb"/>
         <w:keepNext/>
       </w:pPr>
       <w:r>
@@ -1689,29 +1594,19 @@
     </w:p>
     <w:p>
       <w:pPr>
-        <w:pStyle w:val="Beschriftung"/>
+        <w:pStyle w:val="Caption"/>
       </w:pPr>
       <w:r>
         <w:t xml:space="preserve">Figure </w:t>
       </w:r>
-      <w:r>
-        <w:fldChar w:fldCharType="begin"/>
-      </w:r>
-      <w:r>
-        <w:instrText xml:space="preserve"> SEQ Figure \* ARABIC </w:instrText>
-      </w:r>
-      <w:r>
-        <w:fldChar w:fldCharType="separate"/>
-      </w:r>
-      <w:r>
-        <w:rPr>
-          <w:noProof/>
-        </w:rPr>
-        <w:t>1</w:t>
-      </w:r>
-      <w:r>
-        <w:fldChar w:fldCharType="end"/>
-      </w:r>
+      <w:fldSimple w:instr=" SEQ Figure \* ARABIC ">
+        <w:r>
+          <w:rPr>
+            <w:noProof/>
+          </w:rPr>
+          <w:t>1</w:t>
+        </w:r>
+      </w:fldSimple>
       <w:r>
         <w:t xml:space="preserve">: </w:t>
       </w:r>
@@ -1733,7 +1628,7 @@
     </w:p>
     <w:p>
       <w:pPr>
-        <w:pStyle w:val="berschrift1"/>
+        <w:pStyle w:val="Heading1"/>
         <w:rPr>
           <w:lang w:val="en-GB"/>
         </w:rPr>
@@ -1760,6 +1655,7 @@
       </w:pPr>
       <w:r>
         <w:rPr>
+          <w:noProof/>
           <w:lang w:val="en-GB"/>
         </w:rPr>
         <w:drawing>
@@ -1806,18 +1702,24 @@
     </w:p>
     <w:p>
       <w:pPr>
-        <w:pStyle w:val="Beschriftung"/>
+        <w:pStyle w:val="Caption"/>
         <w:rPr>
           <w:lang w:val="en-GB"/>
         </w:rPr>
       </w:pPr>
       <w:r>
+        <w:rPr>
+          <w:lang w:val="en-IN"/>
+        </w:rPr>
         <w:t xml:space="preserve">Figure </w:t>
       </w:r>
       <w:r>
         <w:fldChar w:fldCharType="begin"/>
       </w:r>
       <w:r>
+        <w:rPr>
+          <w:lang w:val="en-IN"/>
+        </w:rPr>
         <w:instrText xml:space="preserve"> SEQ Figure \* ARABIC </w:instrText>
       </w:r>
       <w:r>
@@ -1826,6 +1728,7 @@
       <w:r>
         <w:rPr>
           <w:noProof/>
+          <w:lang w:val="en-IN"/>
         </w:rPr>
         <w:t>2</w:t>
       </w:r>
@@ -1833,28 +1736,15 @@
         <w:fldChar w:fldCharType="end"/>
       </w:r>
       <w:r>
-        <w:t xml:space="preserve">: Entity </w:t>
-      </w:r>
-      <w:proofErr w:type="spellStart"/>
-      <w:r>
-        <w:t>Relationship</w:t>
-      </w:r>
-      <w:proofErr w:type="spellEnd"/>
-      <w:r>
-        <w:t xml:space="preserve"> </w:t>
-      </w:r>
-      <w:proofErr w:type="spellStart"/>
-      <w:r>
-        <w:t>model</w:t>
-      </w:r>
-      <w:proofErr w:type="spellEnd"/>
-      <w:r>
-        <w:t xml:space="preserve"> (13.05.2026)</w:t>
+        <w:rPr>
+          <w:lang w:val="en-IN"/>
+        </w:rPr>
+        <w:t>: Entity Relationship model (13.05.2026)</w:t>
       </w:r>
     </w:p>
     <w:p>
       <w:pPr>
-        <w:pStyle w:val="berschrift1"/>
+        <w:pStyle w:val="Heading1"/>
         <w:rPr>
           <w:lang w:val="en-GB"/>
         </w:rPr>
@@ -1877,7 +1767,7 @@
     </w:p>
     <w:p>
       <w:pPr>
-        <w:pStyle w:val="berschrift1"/>
+        <w:pStyle w:val="Heading1"/>
         <w:rPr>
           <w:lang w:val="en-GB"/>
         </w:rPr>
@@ -1914,24 +1804,37 @@
     </w:p>
     <w:p>
       <w:pPr>
-        <w:pStyle w:val="berschrift1"/>
+        <w:pStyle w:val="Heading1"/>
+        <w:rPr>
+          <w:lang w:val="en-IN"/>
+        </w:rPr>
       </w:pPr>
       <w:bookmarkStart w:id="7" w:name="_Toc233034891"/>
       <w:r>
-        <w:t xml:space="preserve">DMP </w:t>
-      </w:r>
-      <w:proofErr w:type="spellStart"/>
-      <w:r>
-        <w:t>Comparison</w:t>
+        <w:rPr>
+          <w:lang w:val="en-IN"/>
+        </w:rPr>
+        <w:t>DMP Comparison</w:t>
       </w:r>
       <w:bookmarkEnd w:id="7"/>
-      <w:proofErr w:type="spellEnd"/>
     </w:p>
-    <w:p/>
-    <w:p/>
     <w:p>
       <w:pPr>
-        <w:pStyle w:val="berschrift1"/>
+        <w:rPr>
+          <w:lang w:val="en-IN"/>
+        </w:rPr>
+      </w:pPr>
+    </w:p>
+    <w:p>
+      <w:pPr>
+        <w:rPr>
+          <w:lang w:val="en-IN"/>
+        </w:rPr>
+      </w:pPr>
+    </w:p>
+    <w:p>
+      <w:pPr>
+        <w:pStyle w:val="Heading1"/>
       </w:pPr>
       <w:bookmarkStart w:id="8" w:name="_Toc233034892"/>
       <w:proofErr w:type="spellStart"/>
@@ -1968,7 +1871,7 @@
     <w:p/>
     <w:tbl>
       <w:tblPr>
-        <w:tblStyle w:val="EinfacheTabelle3"/>
+        <w:tblStyle w:val="PlainTable3"/>
         <w:tblW w:w="0" w:type="auto"/>
         <w:tblLook w:val="04A0" w:firstRow="1" w:lastRow="0" w:firstColumn="1" w:lastColumn="0" w:noHBand="0" w:noVBand="1"/>
       </w:tblPr>
@@ -2773,7 +2676,7 @@
     </w:tbl>
     <w:p>
       <w:pPr>
-        <w:pStyle w:val="berschrift1"/>
+        <w:pStyle w:val="Heading1"/>
         <w:rPr>
           <w:lang w:val="en-GB"/>
         </w:rPr>
@@ -2781,7 +2684,7 @@
     </w:p>
     <w:p>
       <w:pPr>
-        <w:pStyle w:val="berschrift1"/>
+        <w:pStyle w:val="Heading1"/>
         <w:rPr>
           <w:lang w:val="en-GB"/>
         </w:rPr>
@@ -2824,7 +2727,7 @@
     </w:p>
     <w:tbl>
       <w:tblPr>
-        <w:tblStyle w:val="EinfacheTabelle3"/>
+        <w:tblStyle w:val="PlainTable3"/>
         <w:tblW w:w="0" w:type="auto"/>
         <w:tblLayout w:type="fixed"/>
         <w:tblLook w:val="04A0" w:firstRow="1" w:lastRow="0" w:firstColumn="1" w:lastColumn="0" w:noHBand="0" w:noVBand="1"/>
@@ -2975,7 +2878,13 @@
               <w:rPr>
                 <w:lang w:val="en-GB"/>
               </w:rPr>
-              <w:t>T1.1</w:t>
+              <w:t>T1.</w:t>
+            </w:r>
+            <w:r>
+              <w:rPr>
+                <w:lang w:val="en-GB"/>
+              </w:rPr>
+              <w:t>4</w:t>
             </w:r>
           </w:p>
         </w:tc>
@@ -2987,7 +2896,7 @@
             <w:pPr>
               <w:cnfStyle w:val="000000100000" w:firstRow="0" w:lastRow="0" w:firstColumn="0" w:lastColumn="0" w:oddVBand="0" w:evenVBand="0" w:oddHBand="1" w:evenHBand="0" w:firstRowFirstColumn="0" w:firstRowLastColumn="0" w:lastRowFirstColumn="0" w:lastRowLastColumn="0"/>
               <w:rPr>
-                <w:lang w:val="en-GB"/>
+                <w:lang w:val="en-IN"/>
               </w:rPr>
             </w:pPr>
             <w:r>
@@ -3288,13 +3197,7 @@
               <w:rPr>
                 <w:lang w:val="en-GB"/>
               </w:rPr>
-              <w:t>T1.</w:t>
-            </w:r>
-            <w:r>
-              <w:rPr>
-                <w:lang w:val="en-GB"/>
-              </w:rPr>
-              <w:t>3</w:t>
+              <w:t>T1.3</w:t>
             </w:r>
           </w:p>
         </w:tc>
@@ -3449,25 +3352,7 @@
               <w:rPr>
                 <w:lang w:val="en-GB"/>
               </w:rPr>
-              <w:t>T</w:t>
-            </w:r>
-            <w:r>
-              <w:rPr>
-                <w:lang w:val="en-GB"/>
-              </w:rPr>
-              <w:t>2</w:t>
-            </w:r>
-            <w:r>
-              <w:rPr>
-                <w:lang w:val="en-GB"/>
-              </w:rPr>
-              <w:t>.</w:t>
-            </w:r>
-            <w:r>
-              <w:rPr>
-                <w:lang w:val="en-GB"/>
-              </w:rPr>
-              <w:t>1</w:t>
+              <w:t>T2.1</w:t>
             </w:r>
           </w:p>
         </w:tc>
@@ -3556,38 +3441,18 @@
             <w:pPr>
               <w:cnfStyle w:val="000000000000" w:firstRow="0" w:lastRow="0" w:firstColumn="0" w:lastColumn="0" w:oddVBand="0" w:evenVBand="0" w:oddHBand="0" w:evenHBand="0" w:firstRowFirstColumn="0" w:firstRowLastColumn="0" w:lastRowFirstColumn="0" w:lastRowLastColumn="0"/>
               <w:rPr>
-                <w:lang w:val="en-GB"/>
-              </w:rPr>
-            </w:pPr>
-            <w:r>
-              <w:rPr>
-                <w:lang w:val="en-GB"/>
-              </w:rPr>
-              <w:t>DOI (</w:t>
-            </w:r>
-            <w:proofErr w:type="spellStart"/>
-            <w:r>
-              <w:rPr>
-                <w:lang w:val="en-GB"/>
-              </w:rPr>
-              <w:t>DBRepo</w:t>
-            </w:r>
-            <w:proofErr w:type="spellEnd"/>
-            <w:r>
-              <w:rPr>
-                <w:lang w:val="en-GB"/>
-              </w:rPr>
-              <w:t xml:space="preserve">): </w:t>
-            </w:r>
-            <w:r>
-              <w:rPr>
-                <w:lang w:val="en-GB"/>
-              </w:rPr>
-              <w:t>https://github.com/e12436439/Data-Stewardship-UE-2026S/commit/96597c5dd26227ff39327a8c87b045f65bfde4cd</w:t>
-            </w:r>
-            <w:r>
-              <w:rPr>
-                <w:lang w:val="en-GB"/>
+                <w:lang w:val="pt-BR"/>
+              </w:rPr>
+            </w:pPr>
+            <w:r>
+              <w:rPr>
+                <w:lang w:val="pt-BR"/>
+              </w:rPr>
+              <w:t>DOI (DBRepo): https://github.com/e12436439/Data-Stewardship-UE-2026S/commit/96597c5dd26227ff39327a8c87b045f65bfde4cd</w:t>
+            </w:r>
+            <w:r>
+              <w:rPr>
+                <w:lang w:val="pt-BR"/>
               </w:rPr>
               <w:br/>
             </w:r>
@@ -3703,13 +3568,7 @@
               <w:rPr>
                 <w:lang w:val="en-GB"/>
               </w:rPr>
-              <w:t>T</w:t>
-            </w:r>
-            <w:r>
-              <w:rPr>
-                <w:lang w:val="en-GB"/>
-              </w:rPr>
-              <w:t>3.1</w:t>
+              <w:t>T3.1</w:t>
             </w:r>
           </w:p>
         </w:tc>
@@ -3892,13 +3751,7 @@
               <w:rPr>
                 <w:lang w:val="en-GB"/>
               </w:rPr>
-              <w:t>T</w:t>
-            </w:r>
-            <w:r>
-              <w:rPr>
-                <w:lang w:val="en-GB"/>
-              </w:rPr>
-              <w:t>3.5</w:t>
+              <w:t>T3.5</w:t>
             </w:r>
           </w:p>
         </w:tc>
@@ -4050,13 +3903,7 @@
               <w:rPr>
                 <w:lang w:val="en-GB"/>
               </w:rPr>
-              <w:t>T</w:t>
-            </w:r>
-            <w:r>
-              <w:rPr>
-                <w:lang w:val="en-GB"/>
-              </w:rPr>
-              <w:t>3.9</w:t>
+              <w:t>T3.9</w:t>
             </w:r>
           </w:p>
         </w:tc>
@@ -4205,13 +4052,7 @@
               <w:rPr>
                 <w:lang w:val="en-GB"/>
               </w:rPr>
-              <w:t>T</w:t>
-            </w:r>
-            <w:r>
-              <w:rPr>
-                <w:lang w:val="en-GB"/>
-              </w:rPr>
-              <w:t>4.4</w:t>
+              <w:t>T4.4</w:t>
             </w:r>
           </w:p>
         </w:tc>
@@ -4363,13 +4204,7 @@
               <w:rPr>
                 <w:lang w:val="en-GB"/>
               </w:rPr>
-              <w:t>T</w:t>
-            </w:r>
-            <w:r>
-              <w:rPr>
-                <w:lang w:val="en-GB"/>
-              </w:rPr>
-              <w:t>5.1</w:t>
+              <w:t>T5.1</w:t>
             </w:r>
           </w:p>
         </w:tc>
@@ -4518,13 +4353,7 @@
               <w:rPr>
                 <w:lang w:val="en-GB"/>
               </w:rPr>
-              <w:t>T</w:t>
-            </w:r>
-            <w:r>
-              <w:rPr>
-                <w:lang w:val="en-GB"/>
-              </w:rPr>
-              <w:t>5.2</w:t>
+              <w:t>T5.2</w:t>
             </w:r>
           </w:p>
         </w:tc>
@@ -4684,13 +4513,7 @@
               <w:rPr>
                 <w:lang w:val="en-GB"/>
               </w:rPr>
-              <w:t>T</w:t>
-            </w:r>
-            <w:r>
-              <w:rPr>
-                <w:lang w:val="en-GB"/>
-              </w:rPr>
-              <w:t>6.1</w:t>
+              <w:t>T6.1</w:t>
             </w:r>
           </w:p>
         </w:tc>
@@ -4873,13 +4696,7 @@
               <w:rPr>
                 <w:lang w:val="en-GB"/>
               </w:rPr>
-              <w:t>T</w:t>
-            </w:r>
-            <w:r>
-              <w:rPr>
-                <w:lang w:val="en-GB"/>
-              </w:rPr>
-              <w:t>6.2</w:t>
+              <w:t>T6.2</w:t>
             </w:r>
           </w:p>
         </w:tc>
@@ -4898,21 +4715,7 @@
               <w:rPr>
                 <w:lang w:val="en-GB"/>
               </w:rPr>
-              <w:t xml:space="preserve">I reviewed point </w:t>
-            </w:r>
-            <w:proofErr w:type="gramStart"/>
-            <w:r>
-              <w:rPr>
-                <w:lang w:val="en-GB"/>
-              </w:rPr>
-              <w:t>a and</w:t>
-            </w:r>
-            <w:proofErr w:type="gramEnd"/>
-            <w:r>
-              <w:rPr>
-                <w:lang w:val="en-GB"/>
-              </w:rPr>
-              <w:t xml:space="preserve"> created the review file.</w:t>
+              <w:t>I reviewed point a and created the review file.</w:t>
             </w:r>
           </w:p>
         </w:tc>
@@ -5045,13 +4848,7 @@
               <w:rPr>
                 <w:lang w:val="en-GB"/>
               </w:rPr>
-              <w:t>T</w:t>
-            </w:r>
-            <w:r>
-              <w:rPr>
-                <w:lang w:val="en-GB"/>
-              </w:rPr>
-              <w:t>7.1</w:t>
+              <w:t>T7.1</w:t>
             </w:r>
           </w:p>
         </w:tc>
@@ -5099,6 +4896,12 @@
                 <w:lang w:val="en-GB"/>
               </w:rPr>
             </w:pPr>
+            <w:r>
+              <w:rPr>
+                <w:lang w:val="en-GB"/>
+              </w:rPr>
+              <w:t>https://gitlab.tuwien.ac.at/e52308278/dast-2026-ue/-/commit/d4a3853a9aacddca20e17218f983bcdeff227e64</w:t>
+            </w:r>
           </w:p>
         </w:tc>
         <w:tc>
@@ -5200,6 +5003,1894 @@
         </w:rPr>
       </w:pPr>
     </w:p>
+    <w:p>
+      <w:pPr>
+        <w:rPr>
+          <w:lang w:val="en-GB"/>
+        </w:rPr>
+      </w:pPr>
+    </w:p>
+    <w:p>
+      <w:pPr>
+        <w:rPr>
+          <w:lang w:val="en-GB"/>
+        </w:rPr>
+      </w:pPr>
+      <w:r>
+        <w:rPr>
+          <w:lang w:val="en-GB"/>
+        </w:rPr>
+        <w:t>Student D – Muskan Sodhi – Matriculation No.: 12436439</w:t>
+      </w:r>
+    </w:p>
+    <w:tbl>
+      <w:tblPr>
+        <w:tblStyle w:val="PlainTable3"/>
+        <w:tblW w:w="0" w:type="auto"/>
+        <w:tblLayout w:type="fixed"/>
+        <w:tblLook w:val="04A0" w:firstRow="1" w:lastRow="0" w:firstColumn="1" w:lastColumn="0" w:noHBand="0" w:noVBand="1"/>
+      </w:tblPr>
+      <w:tblGrid>
+        <w:gridCol w:w="832"/>
+        <w:gridCol w:w="2145"/>
+        <w:gridCol w:w="2665"/>
+        <w:gridCol w:w="825"/>
+        <w:gridCol w:w="1059"/>
+        <w:gridCol w:w="1546"/>
+      </w:tblGrid>
+      <w:tr>
+        <w:trPr>
+          <w:cnfStyle w:val="100000000000" w:firstRow="1" w:lastRow="0" w:firstColumn="0" w:lastColumn="0" w:oddVBand="0" w:evenVBand="0" w:oddHBand="0" w:evenHBand="0" w:firstRowFirstColumn="0" w:firstRowLastColumn="0" w:lastRowFirstColumn="0" w:lastRowLastColumn="0"/>
+        </w:trPr>
+        <w:tc>
+          <w:tcPr>
+            <w:cnfStyle w:val="001000000100" w:firstRow="0" w:lastRow="0" w:firstColumn="1" w:lastColumn="0" w:oddVBand="0" w:evenVBand="0" w:oddHBand="0" w:evenHBand="0" w:firstRowFirstColumn="1" w:firstRowLastColumn="0" w:lastRowFirstColumn="0" w:lastRowLastColumn="0"/>
+            <w:tcW w:w="832" w:type="dxa"/>
+          </w:tcPr>
+          <w:p>
+            <w:pPr>
+              <w:rPr>
+                <w:lang w:val="en-GB"/>
+              </w:rPr>
+            </w:pPr>
+            <w:r>
+              <w:rPr>
+                <w:lang w:val="en-GB"/>
+              </w:rPr>
+              <w:t>task</w:t>
+            </w:r>
+          </w:p>
+        </w:tc>
+        <w:tc>
+          <w:tcPr>
+            <w:tcW w:w="2145" w:type="dxa"/>
+          </w:tcPr>
+          <w:p>
+            <w:pPr>
+              <w:cnfStyle w:val="100000000000" w:firstRow="1" w:lastRow="0" w:firstColumn="0" w:lastColumn="0" w:oddVBand="0" w:evenVBand="0" w:oddHBand="0" w:evenHBand="0" w:firstRowFirstColumn="0" w:firstRowLastColumn="0" w:lastRowFirstColumn="0" w:lastRowLastColumn="0"/>
+              <w:rPr>
+                <w:lang w:val="en-GB"/>
+              </w:rPr>
+            </w:pPr>
+            <w:r>
+              <w:rPr>
+                <w:lang w:val="en-GB"/>
+              </w:rPr>
+              <w:t>What i did</w:t>
+            </w:r>
+          </w:p>
+        </w:tc>
+        <w:tc>
+          <w:tcPr>
+            <w:tcW w:w="2665" w:type="dxa"/>
+          </w:tcPr>
+          <w:p>
+            <w:pPr>
+              <w:cnfStyle w:val="100000000000" w:firstRow="1" w:lastRow="0" w:firstColumn="0" w:lastColumn="0" w:oddVBand="0" w:evenVBand="0" w:oddHBand="0" w:evenHBand="0" w:firstRowFirstColumn="0" w:firstRowLastColumn="0" w:lastRowFirstColumn="0" w:lastRowLastColumn="0"/>
+              <w:rPr>
+                <w:lang w:val="en-GB"/>
+              </w:rPr>
+            </w:pPr>
+            <w:r>
+              <w:rPr>
+                <w:lang w:val="en-GB"/>
+              </w:rPr>
+              <w:t>Link/DOI/Commit</w:t>
+            </w:r>
+          </w:p>
+        </w:tc>
+        <w:tc>
+          <w:tcPr>
+            <w:tcW w:w="825" w:type="dxa"/>
+          </w:tcPr>
+          <w:p>
+            <w:pPr>
+              <w:cnfStyle w:val="100000000000" w:firstRow="1" w:lastRow="0" w:firstColumn="0" w:lastColumn="0" w:oddVBand="0" w:evenVBand="0" w:oddHBand="0" w:evenHBand="0" w:firstRowFirstColumn="0" w:firstRowLastColumn="0" w:lastRowFirstColumn="0" w:lastRowLastColumn="0"/>
+              <w:rPr>
+                <w:lang w:val="en-GB"/>
+              </w:rPr>
+            </w:pPr>
+            <w:r>
+              <w:rPr>
+                <w:lang w:val="en-GB"/>
+              </w:rPr>
+              <w:t>DONE</w:t>
+            </w:r>
+          </w:p>
+        </w:tc>
+        <w:tc>
+          <w:tcPr>
+            <w:tcW w:w="1059" w:type="dxa"/>
+          </w:tcPr>
+          <w:p>
+            <w:pPr>
+              <w:cnfStyle w:val="100000000000" w:firstRow="1" w:lastRow="0" w:firstColumn="0" w:lastColumn="0" w:oddVBand="0" w:evenVBand="0" w:oddHBand="0" w:evenHBand="0" w:firstRowFirstColumn="0" w:firstRowLastColumn="0" w:lastRowFirstColumn="0" w:lastRowLastColumn="0"/>
+              <w:rPr>
+                <w:lang w:val="en-GB"/>
+              </w:rPr>
+            </w:pPr>
+            <w:r>
+              <w:rPr>
+                <w:lang w:val="en-GB"/>
+              </w:rPr>
+              <w:t>CHECKED</w:t>
+            </w:r>
+          </w:p>
+        </w:tc>
+        <w:tc>
+          <w:tcPr>
+            <w:tcW w:w="1546" w:type="dxa"/>
+          </w:tcPr>
+          <w:p>
+            <w:pPr>
+              <w:cnfStyle w:val="100000000000" w:firstRow="1" w:lastRow="0" w:firstColumn="0" w:lastColumn="0" w:oddVBand="0" w:evenVBand="0" w:oddHBand="0" w:evenHBand="0" w:firstRowFirstColumn="0" w:firstRowLastColumn="0" w:lastRowFirstColumn="0" w:lastRowLastColumn="0"/>
+              <w:rPr>
+                <w:lang w:val="en-GB"/>
+              </w:rPr>
+            </w:pPr>
+            <w:r>
+              <w:rPr>
+                <w:lang w:val="en-GB"/>
+              </w:rPr>
+              <w:t>CONFIRMED BY</w:t>
+            </w:r>
+          </w:p>
+        </w:tc>
+      </w:tr>
+      <w:tr>
+        <w:trPr>
+          <w:cnfStyle w:val="000000100000" w:firstRow="0" w:lastRow="0" w:firstColumn="0" w:lastColumn="0" w:oddVBand="0" w:evenVBand="0" w:oddHBand="1" w:evenHBand="0" w:firstRowFirstColumn="0" w:firstRowLastColumn="0" w:lastRowFirstColumn="0" w:lastRowLastColumn="0"/>
+        </w:trPr>
+        <w:tc>
+          <w:tcPr>
+            <w:cnfStyle w:val="001000000000" w:firstRow="0" w:lastRow="0" w:firstColumn="1" w:lastColumn="0" w:oddVBand="0" w:evenVBand="0" w:oddHBand="0" w:evenHBand="0" w:firstRowFirstColumn="0" w:firstRowLastColumn="0" w:lastRowFirstColumn="0" w:lastRowLastColumn="0"/>
+            <w:tcW w:w="832" w:type="dxa"/>
+          </w:tcPr>
+          <w:p>
+            <w:pPr>
+              <w:rPr>
+                <w:lang w:val="en-GB"/>
+              </w:rPr>
+            </w:pPr>
+            <w:r>
+              <w:rPr>
+                <w:lang w:val="en-GB"/>
+              </w:rPr>
+              <w:t>T1.</w:t>
+            </w:r>
+            <w:r>
+              <w:rPr>
+                <w:lang w:val="en-GB"/>
+              </w:rPr>
+              <w:t>4</w:t>
+            </w:r>
+          </w:p>
+        </w:tc>
+        <w:tc>
+          <w:tcPr>
+            <w:tcW w:w="2145" w:type="dxa"/>
+          </w:tcPr>
+          <w:p>
+            <w:pPr>
+              <w:cnfStyle w:val="000000100000" w:firstRow="0" w:lastRow="0" w:firstColumn="0" w:lastColumn="0" w:oddVBand="0" w:evenVBand="0" w:oddHBand="1" w:evenHBand="0" w:firstRowFirstColumn="0" w:firstRowLastColumn="0" w:lastRowFirstColumn="0" w:lastRowLastColumn="0"/>
+              <w:rPr>
+                <w:lang w:val="en-IN"/>
+              </w:rPr>
+            </w:pPr>
+            <w:r>
+              <w:rPr>
+                <w:lang w:val="en-IN"/>
+              </w:rPr>
+              <w:t>I created the first GitHub release and prepared the TUWEL role file.</w:t>
+            </w:r>
+          </w:p>
+        </w:tc>
+        <w:tc>
+          <w:tcPr>
+            <w:tcW w:w="2665" w:type="dxa"/>
+          </w:tcPr>
+          <w:p>
+            <w:pPr>
+              <w:cnfStyle w:val="000000100000" w:firstRow="0" w:lastRow="0" w:firstColumn="0" w:lastColumn="0" w:oddVBand="0" w:evenVBand="0" w:oddHBand="1" w:evenHBand="0" w:firstRowFirstColumn="0" w:firstRowLastColumn="0" w:lastRowFirstColumn="0" w:lastRowLastColumn="0"/>
+              <w:rPr>
+                <w:lang w:val="en-GB"/>
+              </w:rPr>
+            </w:pPr>
+            <w:r>
+              <w:rPr>
+                <w:color w:val="000000" w:themeColor="text1"/>
+              </w:rPr>
+              <w:fldChar w:fldCharType="begin"/>
+            </w:r>
+            <w:r>
+              <w:rPr>
+                <w:color w:val="000000" w:themeColor="text1"/>
+                <w:lang w:val="en-IN"/>
+              </w:rPr>
+              <w:instrText>HYPERLINK "https://github.com/e12436439/Data-Stewardship-UE-2026S/releases"</w:instrText>
+            </w:r>
+            <w:r>
+              <w:rPr>
+                <w:color w:val="000000" w:themeColor="text1"/>
+              </w:rPr>
+            </w:r>
+            <w:r>
+              <w:rPr>
+                <w:color w:val="000000" w:themeColor="text1"/>
+              </w:rPr>
+              <w:fldChar w:fldCharType="separate"/>
+            </w:r>
+            <w:r>
+              <w:rPr>
+                <w:rStyle w:val="Hyperlink"/>
+                <w:color w:val="000000" w:themeColor="text1"/>
+                <w:lang w:val="en-GB"/>
+              </w:rPr>
+              <w:t>https://github.com/e12436439/Data-Stewardship-UE-2026S/releases/tag/Part3</w:t>
+            </w:r>
+            <w:r>
+              <w:rPr>
+                <w:color w:val="000000" w:themeColor="text1"/>
+              </w:rPr>
+              <w:fldChar w:fldCharType="end"/>
+            </w:r>
+          </w:p>
+        </w:tc>
+        <w:tc>
+          <w:tcPr>
+            <w:tcW w:w="825" w:type="dxa"/>
+          </w:tcPr>
+          <w:p>
+            <w:pPr>
+              <w:jc w:val="center"/>
+              <w:cnfStyle w:val="000000100000" w:firstRow="0" w:lastRow="0" w:firstColumn="0" w:lastColumn="0" w:oddVBand="0" w:evenVBand="0" w:oddHBand="1" w:evenHBand="0" w:firstRowFirstColumn="0" w:firstRowLastColumn="0" w:lastRowFirstColumn="0" w:lastRowLastColumn="0"/>
+              <w:rPr>
+                <w:lang w:val="en-GB"/>
+              </w:rPr>
+            </w:pPr>
+            <w:r>
+              <w:rPr>
+                <w:noProof/>
+                <w:lang w:val="en-GB"/>
+              </w:rPr>
+              <w:drawing>
+                <wp:inline distT="0" distB="0" distL="0" distR="0" wp14:anchorId="1675CAE4" wp14:editId="3FF54865">
+                  <wp:extent cx="190500" cy="190500"/>
+                  <wp:effectExtent l="0" t="0" r="0" b="0"/>
+                  <wp:docPr id="208640452" name="Grafik 4" descr="Häkchen mit einfarbiger Füllung"/>
+                  <wp:cNvGraphicFramePr>
+                    <a:graphicFrameLocks xmlns:a="http://schemas.openxmlformats.org/drawingml/2006/main" noChangeAspect="1"/>
+                  </wp:cNvGraphicFramePr>
+                  <a:graphic xmlns:a="http://schemas.openxmlformats.org/drawingml/2006/main">
+                    <a:graphicData uri="http://schemas.openxmlformats.org/drawingml/2006/picture">
+                      <pic:pic xmlns:pic="http://schemas.openxmlformats.org/drawingml/2006/picture">
+                        <pic:nvPicPr>
+                          <pic:cNvPr id="39936774" name="Grafik 39936774" descr="Häkchen mit einfarbiger Füllung"/>
+                          <pic:cNvPicPr/>
+                        </pic:nvPicPr>
+                        <pic:blipFill>
+                          <a:blip r:embed="rId9" cstate="print">
+                            <a:extLst>
+                              <a:ext uri="{28A0092B-C50C-407E-A947-70E740481C1C}">
+                                <a14:useLocalDpi xmlns:a14="http://schemas.microsoft.com/office/drawing/2010/main" val="0"/>
+                              </a:ext>
+                              <a:ext uri="{96DAC541-7B7A-43D3-8B79-37D633B846F1}">
+                                <asvg:svgBlip xmlns:asvg="http://schemas.microsoft.com/office/drawing/2016/SVG/main" r:embed="rId10"/>
+                              </a:ext>
+                            </a:extLst>
+                          </a:blip>
+                          <a:stretch>
+                            <a:fillRect/>
+                          </a:stretch>
+                        </pic:blipFill>
+                        <pic:spPr>
+                          <a:xfrm>
+                            <a:off x="0" y="0"/>
+                            <a:ext cx="190500" cy="190500"/>
+                          </a:xfrm>
+                          <a:prstGeom prst="rect">
+                            <a:avLst/>
+                          </a:prstGeom>
+                        </pic:spPr>
+                      </pic:pic>
+                    </a:graphicData>
+                  </a:graphic>
+                </wp:inline>
+              </w:drawing>
+            </w:r>
+          </w:p>
+        </w:tc>
+        <w:tc>
+          <w:tcPr>
+            <w:tcW w:w="1059" w:type="dxa"/>
+          </w:tcPr>
+          <w:p>
+            <w:pPr>
+              <w:cnfStyle w:val="000000100000" w:firstRow="0" w:lastRow="0" w:firstColumn="0" w:lastColumn="0" w:oddVBand="0" w:evenVBand="0" w:oddHBand="1" w:evenHBand="0" w:firstRowFirstColumn="0" w:firstRowLastColumn="0" w:lastRowFirstColumn="0" w:lastRowLastColumn="0"/>
+              <w:rPr>
+                <w:lang w:val="en-GB"/>
+              </w:rPr>
+            </w:pPr>
+          </w:p>
+        </w:tc>
+        <w:tc>
+          <w:tcPr>
+            <w:tcW w:w="1546" w:type="dxa"/>
+          </w:tcPr>
+          <w:p>
+            <w:pPr>
+              <w:cnfStyle w:val="000000100000" w:firstRow="0" w:lastRow="0" w:firstColumn="0" w:lastColumn="0" w:oddVBand="0" w:evenVBand="0" w:oddHBand="1" w:evenHBand="0" w:firstRowFirstColumn="0" w:firstRowLastColumn="0" w:lastRowFirstColumn="0" w:lastRowLastColumn="0"/>
+              <w:rPr>
+                <w:lang w:val="en-GB"/>
+              </w:rPr>
+            </w:pPr>
+          </w:p>
+        </w:tc>
+      </w:tr>
+      <w:tr>
+        <w:tc>
+          <w:tcPr>
+            <w:cnfStyle w:val="001000000000" w:firstRow="0" w:lastRow="0" w:firstColumn="1" w:lastColumn="0" w:oddVBand="0" w:evenVBand="0" w:oddHBand="0" w:evenHBand="0" w:firstRowFirstColumn="0" w:firstRowLastColumn="0" w:lastRowFirstColumn="0" w:lastRowLastColumn="0"/>
+            <w:tcW w:w="832" w:type="dxa"/>
+          </w:tcPr>
+          <w:p>
+            <w:pPr>
+              <w:rPr>
+                <w:lang w:val="en-GB"/>
+              </w:rPr>
+            </w:pPr>
+            <w:r>
+              <w:rPr>
+                <w:lang w:val="en-GB"/>
+              </w:rPr>
+              <w:t>T</w:t>
+            </w:r>
+            <w:r>
+              <w:rPr>
+                <w:lang w:val="en-GB"/>
+              </w:rPr>
+              <w:t>2.4</w:t>
+            </w:r>
+          </w:p>
+        </w:tc>
+        <w:tc>
+          <w:tcPr>
+            <w:tcW w:w="2145" w:type="dxa"/>
+          </w:tcPr>
+          <w:p>
+            <w:pPr>
+              <w:cnfStyle w:val="000000000000" w:firstRow="0" w:lastRow="0" w:firstColumn="0" w:lastColumn="0" w:oddVBand="0" w:evenVBand="0" w:oddHBand="0" w:evenHBand="0" w:firstRowFirstColumn="0" w:firstRowLastColumn="0" w:lastRowFirstColumn="0" w:lastRowLastColumn="0"/>
+              <w:rPr>
+                <w:lang w:val="en-IN"/>
+              </w:rPr>
+            </w:pPr>
+            <w:r>
+              <w:rPr>
+                <w:lang w:val="en-IN"/>
+              </w:rPr>
+              <w:t>I created SQL view definitions for the ML-ready data.</w:t>
+            </w:r>
+          </w:p>
+        </w:tc>
+        <w:tc>
+          <w:tcPr>
+            <w:tcW w:w="2665" w:type="dxa"/>
+          </w:tcPr>
+          <w:p>
+            <w:pPr>
+              <w:cnfStyle w:val="000000000000" w:firstRow="0" w:lastRow="0" w:firstColumn="0" w:lastColumn="0" w:oddVBand="0" w:evenVBand="0" w:oddHBand="0" w:evenHBand="0" w:firstRowFirstColumn="0" w:firstRowLastColumn="0" w:lastRowFirstColumn="0" w:lastRowLastColumn="0"/>
+              <w:rPr>
+                <w:lang w:val="en-GB"/>
+              </w:rPr>
+            </w:pPr>
+            <w:r>
+              <w:rPr>
+                <w:lang w:val="en-GB"/>
+              </w:rPr>
+              <w:t>https://github.com/e12436439/Data-Stewardship-UE-2026S/commit/30229223eaa7280e4db0d4cd24a5786bb48dd404</w:t>
+            </w:r>
+          </w:p>
+        </w:tc>
+        <w:tc>
+          <w:tcPr>
+            <w:tcW w:w="825" w:type="dxa"/>
+          </w:tcPr>
+          <w:p>
+            <w:pPr>
+              <w:jc w:val="center"/>
+              <w:cnfStyle w:val="000000000000" w:firstRow="0" w:lastRow="0" w:firstColumn="0" w:lastColumn="0" w:oddVBand="0" w:evenVBand="0" w:oddHBand="0" w:evenHBand="0" w:firstRowFirstColumn="0" w:firstRowLastColumn="0" w:lastRowFirstColumn="0" w:lastRowLastColumn="0"/>
+              <w:rPr>
+                <w:lang w:val="en-GB"/>
+              </w:rPr>
+            </w:pPr>
+            <w:r>
+              <w:rPr>
+                <w:noProof/>
+                <w:lang w:val="en-GB"/>
+              </w:rPr>
+              <w:drawing>
+                <wp:inline distT="0" distB="0" distL="0" distR="0" wp14:anchorId="3FE7340A" wp14:editId="23C44C4F">
+                  <wp:extent cx="190500" cy="190500"/>
+                  <wp:effectExtent l="0" t="0" r="0" b="0"/>
+                  <wp:docPr id="1731086245" name="Grafik 4" descr="Häkchen mit einfarbiger Füllung"/>
+                  <wp:cNvGraphicFramePr>
+                    <a:graphicFrameLocks xmlns:a="http://schemas.openxmlformats.org/drawingml/2006/main" noChangeAspect="1"/>
+                  </wp:cNvGraphicFramePr>
+                  <a:graphic xmlns:a="http://schemas.openxmlformats.org/drawingml/2006/main">
+                    <a:graphicData uri="http://schemas.openxmlformats.org/drawingml/2006/picture">
+                      <pic:pic xmlns:pic="http://schemas.openxmlformats.org/drawingml/2006/picture">
+                        <pic:nvPicPr>
+                          <pic:cNvPr id="39936774" name="Grafik 39936774" descr="Häkchen mit einfarbiger Füllung"/>
+                          <pic:cNvPicPr/>
+                        </pic:nvPicPr>
+                        <pic:blipFill>
+                          <a:blip r:embed="rId9" cstate="print">
+                            <a:extLst>
+                              <a:ext uri="{28A0092B-C50C-407E-A947-70E740481C1C}">
+                                <a14:useLocalDpi xmlns:a14="http://schemas.microsoft.com/office/drawing/2010/main" val="0"/>
+                              </a:ext>
+                              <a:ext uri="{96DAC541-7B7A-43D3-8B79-37D633B846F1}">
+                                <asvg:svgBlip xmlns:asvg="http://schemas.microsoft.com/office/drawing/2016/SVG/main" r:embed="rId10"/>
+                              </a:ext>
+                            </a:extLst>
+                          </a:blip>
+                          <a:stretch>
+                            <a:fillRect/>
+                          </a:stretch>
+                        </pic:blipFill>
+                        <pic:spPr>
+                          <a:xfrm>
+                            <a:off x="0" y="0"/>
+                            <a:ext cx="190500" cy="190500"/>
+                          </a:xfrm>
+                          <a:prstGeom prst="rect">
+                            <a:avLst/>
+                          </a:prstGeom>
+                        </pic:spPr>
+                      </pic:pic>
+                    </a:graphicData>
+                  </a:graphic>
+                </wp:inline>
+              </w:drawing>
+            </w:r>
+          </w:p>
+        </w:tc>
+        <w:tc>
+          <w:tcPr>
+            <w:tcW w:w="1059" w:type="dxa"/>
+          </w:tcPr>
+          <w:p>
+            <w:pPr>
+              <w:cnfStyle w:val="000000000000" w:firstRow="0" w:lastRow="0" w:firstColumn="0" w:lastColumn="0" w:oddVBand="0" w:evenVBand="0" w:oddHBand="0" w:evenHBand="0" w:firstRowFirstColumn="0" w:firstRowLastColumn="0" w:lastRowFirstColumn="0" w:lastRowLastColumn="0"/>
+              <w:rPr>
+                <w:lang w:val="en-GB"/>
+              </w:rPr>
+            </w:pPr>
+          </w:p>
+        </w:tc>
+        <w:tc>
+          <w:tcPr>
+            <w:tcW w:w="1546" w:type="dxa"/>
+          </w:tcPr>
+          <w:p>
+            <w:pPr>
+              <w:cnfStyle w:val="000000000000" w:firstRow="0" w:lastRow="0" w:firstColumn="0" w:lastColumn="0" w:oddVBand="0" w:evenVBand="0" w:oddHBand="0" w:evenHBand="0" w:firstRowFirstColumn="0" w:firstRowLastColumn="0" w:lastRowFirstColumn="0" w:lastRowLastColumn="0"/>
+              <w:rPr>
+                <w:lang w:val="en-GB"/>
+              </w:rPr>
+            </w:pPr>
+          </w:p>
+        </w:tc>
+      </w:tr>
+      <w:tr>
+        <w:trPr>
+          <w:cnfStyle w:val="000000100000" w:firstRow="0" w:lastRow="0" w:firstColumn="0" w:lastColumn="0" w:oddVBand="0" w:evenVBand="0" w:oddHBand="1" w:evenHBand="0" w:firstRowFirstColumn="0" w:firstRowLastColumn="0" w:lastRowFirstColumn="0" w:lastRowLastColumn="0"/>
+        </w:trPr>
+        <w:tc>
+          <w:tcPr>
+            <w:cnfStyle w:val="001000000000" w:firstRow="0" w:lastRow="0" w:firstColumn="1" w:lastColumn="0" w:oddVBand="0" w:evenVBand="0" w:oddHBand="0" w:evenHBand="0" w:firstRowFirstColumn="0" w:firstRowLastColumn="0" w:lastRowFirstColumn="0" w:lastRowLastColumn="0"/>
+            <w:tcW w:w="832" w:type="dxa"/>
+          </w:tcPr>
+          <w:p>
+            <w:pPr>
+              <w:rPr>
+                <w:lang w:val="en-GB"/>
+              </w:rPr>
+            </w:pPr>
+            <w:r>
+              <w:rPr>
+                <w:lang w:val="en-GB"/>
+              </w:rPr>
+              <w:t>T</w:t>
+            </w:r>
+            <w:r>
+              <w:rPr>
+                <w:lang w:val="en-GB"/>
+              </w:rPr>
+              <w:t>2.6</w:t>
+            </w:r>
+          </w:p>
+        </w:tc>
+        <w:tc>
+          <w:tcPr>
+            <w:tcW w:w="2145" w:type="dxa"/>
+          </w:tcPr>
+          <w:p>
+            <w:pPr>
+              <w:cnfStyle w:val="000000100000" w:firstRow="0" w:lastRow="0" w:firstColumn="0" w:lastColumn="0" w:oddVBand="0" w:evenVBand="0" w:oddHBand="1" w:evenHBand="0" w:firstRowFirstColumn="0" w:firstRowLastColumn="0" w:lastRowFirstColumn="0" w:lastRowLastColumn="0"/>
+              <w:rPr>
+                <w:lang w:val="en-GB"/>
+              </w:rPr>
+            </w:pPr>
+            <w:r>
+              <w:rPr>
+                <w:lang w:val="en-IN"/>
+              </w:rPr>
+              <w:t xml:space="preserve">I reimplemented data loading using the </w:t>
+            </w:r>
+            <w:proofErr w:type="spellStart"/>
+            <w:r>
+              <w:rPr>
+                <w:lang w:val="en-IN"/>
+              </w:rPr>
+              <w:t>DBRepo</w:t>
+            </w:r>
+            <w:proofErr w:type="spellEnd"/>
+            <w:r>
+              <w:rPr>
+                <w:lang w:val="en-IN"/>
+              </w:rPr>
+              <w:t xml:space="preserve"> REST API.</w:t>
+            </w:r>
+          </w:p>
+        </w:tc>
+        <w:tc>
+          <w:tcPr>
+            <w:tcW w:w="2665" w:type="dxa"/>
+          </w:tcPr>
+          <w:p>
+            <w:pPr>
+              <w:cnfStyle w:val="000000100000" w:firstRow="0" w:lastRow="0" w:firstColumn="0" w:lastColumn="0" w:oddVBand="0" w:evenVBand="0" w:oddHBand="1" w:evenHBand="0" w:firstRowFirstColumn="0" w:firstRowLastColumn="0" w:lastRowFirstColumn="0" w:lastRowLastColumn="0"/>
+              <w:rPr>
+                <w:lang w:val="en-GB"/>
+              </w:rPr>
+            </w:pPr>
+            <w:r>
+              <w:rPr>
+                <w:lang w:val="en-GB"/>
+              </w:rPr>
+              <w:t>https://github.com/e12436439/Data-Stewardship-UE-2026S/commit/33c2bee766c792e9ddb439679332b692071d5231</w:t>
+            </w:r>
+          </w:p>
+        </w:tc>
+        <w:tc>
+          <w:tcPr>
+            <w:tcW w:w="825" w:type="dxa"/>
+          </w:tcPr>
+          <w:p>
+            <w:pPr>
+              <w:jc w:val="center"/>
+              <w:cnfStyle w:val="000000100000" w:firstRow="0" w:lastRow="0" w:firstColumn="0" w:lastColumn="0" w:oddVBand="0" w:evenVBand="0" w:oddHBand="1" w:evenHBand="0" w:firstRowFirstColumn="0" w:firstRowLastColumn="0" w:lastRowFirstColumn="0" w:lastRowLastColumn="0"/>
+              <w:rPr>
+                <w:lang w:val="en-GB"/>
+              </w:rPr>
+            </w:pPr>
+            <w:r>
+              <w:rPr>
+                <w:noProof/>
+                <w:lang w:val="en-GB"/>
+              </w:rPr>
+              <w:drawing>
+                <wp:inline distT="0" distB="0" distL="0" distR="0" wp14:anchorId="3CB04306" wp14:editId="51080C3A">
+                  <wp:extent cx="190500" cy="190500"/>
+                  <wp:effectExtent l="0" t="0" r="0" b="0"/>
+                  <wp:docPr id="1130403766" name="Grafik 4" descr="Häkchen mit einfarbiger Füllung"/>
+                  <wp:cNvGraphicFramePr>
+                    <a:graphicFrameLocks xmlns:a="http://schemas.openxmlformats.org/drawingml/2006/main" noChangeAspect="1"/>
+                  </wp:cNvGraphicFramePr>
+                  <a:graphic xmlns:a="http://schemas.openxmlformats.org/drawingml/2006/main">
+                    <a:graphicData uri="http://schemas.openxmlformats.org/drawingml/2006/picture">
+                      <pic:pic xmlns:pic="http://schemas.openxmlformats.org/drawingml/2006/picture">
+                        <pic:nvPicPr>
+                          <pic:cNvPr id="39936774" name="Grafik 39936774" descr="Häkchen mit einfarbiger Füllung"/>
+                          <pic:cNvPicPr/>
+                        </pic:nvPicPr>
+                        <pic:blipFill>
+                          <a:blip r:embed="rId9" cstate="print">
+                            <a:extLst>
+                              <a:ext uri="{28A0092B-C50C-407E-A947-70E740481C1C}">
+                                <a14:useLocalDpi xmlns:a14="http://schemas.microsoft.com/office/drawing/2010/main" val="0"/>
+                              </a:ext>
+                              <a:ext uri="{96DAC541-7B7A-43D3-8B79-37D633B846F1}">
+                                <asvg:svgBlip xmlns:asvg="http://schemas.microsoft.com/office/drawing/2016/SVG/main" r:embed="rId10"/>
+                              </a:ext>
+                            </a:extLst>
+                          </a:blip>
+                          <a:stretch>
+                            <a:fillRect/>
+                          </a:stretch>
+                        </pic:blipFill>
+                        <pic:spPr>
+                          <a:xfrm>
+                            <a:off x="0" y="0"/>
+                            <a:ext cx="190500" cy="190500"/>
+                          </a:xfrm>
+                          <a:prstGeom prst="rect">
+                            <a:avLst/>
+                          </a:prstGeom>
+                        </pic:spPr>
+                      </pic:pic>
+                    </a:graphicData>
+                  </a:graphic>
+                </wp:inline>
+              </w:drawing>
+            </w:r>
+          </w:p>
+        </w:tc>
+        <w:tc>
+          <w:tcPr>
+            <w:tcW w:w="1059" w:type="dxa"/>
+          </w:tcPr>
+          <w:p>
+            <w:pPr>
+              <w:cnfStyle w:val="000000100000" w:firstRow="0" w:lastRow="0" w:firstColumn="0" w:lastColumn="0" w:oddVBand="0" w:evenVBand="0" w:oddHBand="1" w:evenHBand="0" w:firstRowFirstColumn="0" w:firstRowLastColumn="0" w:lastRowFirstColumn="0" w:lastRowLastColumn="0"/>
+              <w:rPr>
+                <w:lang w:val="en-GB"/>
+              </w:rPr>
+            </w:pPr>
+          </w:p>
+        </w:tc>
+        <w:tc>
+          <w:tcPr>
+            <w:tcW w:w="1546" w:type="dxa"/>
+          </w:tcPr>
+          <w:p>
+            <w:pPr>
+              <w:cnfStyle w:val="000000100000" w:firstRow="0" w:lastRow="0" w:firstColumn="0" w:lastColumn="0" w:oddVBand="0" w:evenVBand="0" w:oddHBand="1" w:evenHBand="0" w:firstRowFirstColumn="0" w:firstRowLastColumn="0" w:lastRowFirstColumn="0" w:lastRowLastColumn="0"/>
+              <w:rPr>
+                <w:lang w:val="en-GB"/>
+              </w:rPr>
+            </w:pPr>
+          </w:p>
+        </w:tc>
+      </w:tr>
+      <w:tr>
+        <w:tc>
+          <w:tcPr>
+            <w:cnfStyle w:val="001000000000" w:firstRow="0" w:lastRow="0" w:firstColumn="1" w:lastColumn="0" w:oddVBand="0" w:evenVBand="0" w:oddHBand="0" w:evenHBand="0" w:firstRowFirstColumn="0" w:firstRowLastColumn="0" w:lastRowFirstColumn="0" w:lastRowLastColumn="0"/>
+            <w:tcW w:w="832" w:type="dxa"/>
+          </w:tcPr>
+          <w:p>
+            <w:pPr>
+              <w:rPr>
+                <w:lang w:val="en-GB"/>
+              </w:rPr>
+            </w:pPr>
+            <w:r>
+              <w:rPr>
+                <w:lang w:val="en-GB"/>
+              </w:rPr>
+              <w:t>T</w:t>
+            </w:r>
+            <w:r>
+              <w:rPr>
+                <w:lang w:val="en-GB"/>
+              </w:rPr>
+              <w:t>3.4</w:t>
+            </w:r>
+          </w:p>
+        </w:tc>
+        <w:tc>
+          <w:tcPr>
+            <w:tcW w:w="2145" w:type="dxa"/>
+          </w:tcPr>
+          <w:p>
+            <w:pPr>
+              <w:cnfStyle w:val="000000000000" w:firstRow="0" w:lastRow="0" w:firstColumn="0" w:lastColumn="0" w:oddVBand="0" w:evenVBand="0" w:oddHBand="0" w:evenHBand="0" w:firstRowFirstColumn="0" w:firstRowLastColumn="0" w:lastRowFirstColumn="0" w:lastRowLastColumn="0"/>
+              <w:rPr>
+                <w:lang w:val="en-IN"/>
+              </w:rPr>
+            </w:pPr>
+            <w:r>
+              <w:rPr>
+                <w:lang w:val="en-IN"/>
+              </w:rPr>
+              <w:t>I created the Croissant metadata file for the input dataset.</w:t>
+            </w:r>
+          </w:p>
+        </w:tc>
+        <w:tc>
+          <w:tcPr>
+            <w:tcW w:w="2665" w:type="dxa"/>
+          </w:tcPr>
+          <w:p>
+            <w:pPr>
+              <w:cnfStyle w:val="000000000000" w:firstRow="0" w:lastRow="0" w:firstColumn="0" w:lastColumn="0" w:oddVBand="0" w:evenVBand="0" w:oddHBand="0" w:evenHBand="0" w:firstRowFirstColumn="0" w:firstRowLastColumn="0" w:lastRowFirstColumn="0" w:lastRowLastColumn="0"/>
+              <w:rPr>
+                <w:lang w:val="en-IN"/>
+              </w:rPr>
+            </w:pPr>
+            <w:r>
+              <w:rPr>
+                <w:lang w:val="en-IN"/>
+              </w:rPr>
+              <w:t>https://github.com/e12436439/Data-Stewardship-UE-2026S/commit/59c65f587cb543487aae02685520a67fc8c6049e</w:t>
+            </w:r>
+            <w:r>
+              <w:rPr>
+                <w:lang w:val="en-IN"/>
+              </w:rPr>
+              <w:br/>
+            </w:r>
+          </w:p>
+        </w:tc>
+        <w:tc>
+          <w:tcPr>
+            <w:tcW w:w="825" w:type="dxa"/>
+          </w:tcPr>
+          <w:p>
+            <w:pPr>
+              <w:jc w:val="center"/>
+              <w:cnfStyle w:val="000000000000" w:firstRow="0" w:lastRow="0" w:firstColumn="0" w:lastColumn="0" w:oddVBand="0" w:evenVBand="0" w:oddHBand="0" w:evenHBand="0" w:firstRowFirstColumn="0" w:firstRowLastColumn="0" w:lastRowFirstColumn="0" w:lastRowLastColumn="0"/>
+              <w:rPr>
+                <w:lang w:val="en-GB"/>
+              </w:rPr>
+            </w:pPr>
+            <w:r>
+              <w:rPr>
+                <w:noProof/>
+                <w:lang w:val="en-GB"/>
+              </w:rPr>
+              <w:drawing>
+                <wp:inline distT="0" distB="0" distL="0" distR="0" wp14:anchorId="3CC9FF1D" wp14:editId="2C4CC08C">
+                  <wp:extent cx="190500" cy="190500"/>
+                  <wp:effectExtent l="0" t="0" r="0" b="0"/>
+                  <wp:docPr id="1365715214" name="Grafik 4" descr="Häkchen mit einfarbiger Füllung"/>
+                  <wp:cNvGraphicFramePr>
+                    <a:graphicFrameLocks xmlns:a="http://schemas.openxmlformats.org/drawingml/2006/main" noChangeAspect="1"/>
+                  </wp:cNvGraphicFramePr>
+                  <a:graphic xmlns:a="http://schemas.openxmlformats.org/drawingml/2006/main">
+                    <a:graphicData uri="http://schemas.openxmlformats.org/drawingml/2006/picture">
+                      <pic:pic xmlns:pic="http://schemas.openxmlformats.org/drawingml/2006/picture">
+                        <pic:nvPicPr>
+                          <pic:cNvPr id="39936774" name="Grafik 39936774" descr="Häkchen mit einfarbiger Füllung"/>
+                          <pic:cNvPicPr/>
+                        </pic:nvPicPr>
+                        <pic:blipFill>
+                          <a:blip r:embed="rId9" cstate="print">
+                            <a:extLst>
+                              <a:ext uri="{28A0092B-C50C-407E-A947-70E740481C1C}">
+                                <a14:useLocalDpi xmlns:a14="http://schemas.microsoft.com/office/drawing/2010/main" val="0"/>
+                              </a:ext>
+                              <a:ext uri="{96DAC541-7B7A-43D3-8B79-37D633B846F1}">
+                                <asvg:svgBlip xmlns:asvg="http://schemas.microsoft.com/office/drawing/2016/SVG/main" r:embed="rId10"/>
+                              </a:ext>
+                            </a:extLst>
+                          </a:blip>
+                          <a:stretch>
+                            <a:fillRect/>
+                          </a:stretch>
+                        </pic:blipFill>
+                        <pic:spPr>
+                          <a:xfrm>
+                            <a:off x="0" y="0"/>
+                            <a:ext cx="190500" cy="190500"/>
+                          </a:xfrm>
+                          <a:prstGeom prst="rect">
+                            <a:avLst/>
+                          </a:prstGeom>
+                        </pic:spPr>
+                      </pic:pic>
+                    </a:graphicData>
+                  </a:graphic>
+                </wp:inline>
+              </w:drawing>
+            </w:r>
+          </w:p>
+        </w:tc>
+        <w:tc>
+          <w:tcPr>
+            <w:tcW w:w="1059" w:type="dxa"/>
+          </w:tcPr>
+          <w:p>
+            <w:pPr>
+              <w:cnfStyle w:val="000000000000" w:firstRow="0" w:lastRow="0" w:firstColumn="0" w:lastColumn="0" w:oddVBand="0" w:evenVBand="0" w:oddHBand="0" w:evenHBand="0" w:firstRowFirstColumn="0" w:firstRowLastColumn="0" w:lastRowFirstColumn="0" w:lastRowLastColumn="0"/>
+              <w:rPr>
+                <w:lang w:val="en-GB"/>
+              </w:rPr>
+            </w:pPr>
+          </w:p>
+        </w:tc>
+        <w:tc>
+          <w:tcPr>
+            <w:tcW w:w="1546" w:type="dxa"/>
+          </w:tcPr>
+          <w:p>
+            <w:pPr>
+              <w:cnfStyle w:val="000000000000" w:firstRow="0" w:lastRow="0" w:firstColumn="0" w:lastColumn="0" w:oddVBand="0" w:evenVBand="0" w:oddHBand="0" w:evenHBand="0" w:firstRowFirstColumn="0" w:firstRowLastColumn="0" w:lastRowFirstColumn="0" w:lastRowLastColumn="0"/>
+              <w:rPr>
+                <w:lang w:val="en-GB"/>
+              </w:rPr>
+            </w:pPr>
+          </w:p>
+        </w:tc>
+      </w:tr>
+      <w:tr>
+        <w:trPr>
+          <w:cnfStyle w:val="000000100000" w:firstRow="0" w:lastRow="0" w:firstColumn="0" w:lastColumn="0" w:oddVBand="0" w:evenVBand="0" w:oddHBand="1" w:evenHBand="0" w:firstRowFirstColumn="0" w:firstRowLastColumn="0" w:lastRowFirstColumn="0" w:lastRowLastColumn="0"/>
+        </w:trPr>
+        <w:tc>
+          <w:tcPr>
+            <w:cnfStyle w:val="001000000000" w:firstRow="0" w:lastRow="0" w:firstColumn="1" w:lastColumn="0" w:oddVBand="0" w:evenVBand="0" w:oddHBand="0" w:evenHBand="0" w:firstRowFirstColumn="0" w:firstRowLastColumn="0" w:lastRowFirstColumn="0" w:lastRowLastColumn="0"/>
+            <w:tcW w:w="832" w:type="dxa"/>
+          </w:tcPr>
+          <w:p>
+            <w:pPr>
+              <w:rPr>
+                <w:lang w:val="en-GB"/>
+              </w:rPr>
+            </w:pPr>
+            <w:r>
+              <w:rPr>
+                <w:lang w:val="en-GB"/>
+              </w:rPr>
+              <w:t>T3.</w:t>
+            </w:r>
+            <w:r>
+              <w:rPr>
+                <w:lang w:val="en-GB"/>
+              </w:rPr>
+              <w:t>8</w:t>
+            </w:r>
+          </w:p>
+        </w:tc>
+        <w:tc>
+          <w:tcPr>
+            <w:tcW w:w="2145" w:type="dxa"/>
+          </w:tcPr>
+          <w:p>
+            <w:pPr>
+              <w:cnfStyle w:val="000000100000" w:firstRow="0" w:lastRow="0" w:firstColumn="0" w:lastColumn="0" w:oddVBand="0" w:evenVBand="0" w:oddHBand="1" w:evenHBand="0" w:firstRowFirstColumn="0" w:firstRowLastColumn="0" w:lastRowFirstColumn="0" w:lastRowLastColumn="0"/>
+              <w:rPr>
+                <w:lang w:val="en-IN"/>
+              </w:rPr>
+            </w:pPr>
+            <w:r>
+              <w:rPr>
+                <w:lang w:val="en-GB"/>
+              </w:rPr>
+              <w:t xml:space="preserve">I connected GitHub with </w:t>
+            </w:r>
+            <w:proofErr w:type="spellStart"/>
+            <w:r>
+              <w:rPr>
+                <w:lang w:val="en-GB"/>
+              </w:rPr>
+              <w:t>Zenodo</w:t>
+            </w:r>
+            <w:proofErr w:type="spellEnd"/>
+            <w:r>
+              <w:rPr>
+                <w:lang w:val="en-GB"/>
+              </w:rPr>
+              <w:t xml:space="preserve"> and checked the </w:t>
+            </w:r>
+            <w:proofErr w:type="spellStart"/>
+            <w:r>
+              <w:rPr>
+                <w:lang w:val="en-GB"/>
+              </w:rPr>
+              <w:t>Zenodo</w:t>
+            </w:r>
+            <w:proofErr w:type="spellEnd"/>
+            <w:r>
+              <w:rPr>
+                <w:lang w:val="en-GB"/>
+              </w:rPr>
+              <w:t xml:space="preserve"> DOI.</w:t>
+            </w:r>
+          </w:p>
+        </w:tc>
+        <w:tc>
+          <w:tcPr>
+            <w:tcW w:w="2665" w:type="dxa"/>
+          </w:tcPr>
+          <w:p>
+            <w:pPr>
+              <w:cnfStyle w:val="000000100000" w:firstRow="0" w:lastRow="0" w:firstColumn="0" w:lastColumn="0" w:oddVBand="0" w:evenVBand="0" w:oddHBand="1" w:evenHBand="0" w:firstRowFirstColumn="0" w:firstRowLastColumn="0" w:lastRowFirstColumn="0" w:lastRowLastColumn="0"/>
+              <w:rPr>
+                <w:lang w:val="en-IN"/>
+              </w:rPr>
+            </w:pPr>
+            <w:r>
+              <w:rPr>
+                <w:u w:val="single"/>
+                <w:lang w:val="en-IN"/>
+              </w:rPr>
+              <w:t>https://doi.org/10.5281/zenodo.20463919</w:t>
+            </w:r>
+          </w:p>
+          <w:p>
+            <w:pPr>
+              <w:cnfStyle w:val="000000100000" w:firstRow="0" w:lastRow="0" w:firstColumn="0" w:lastColumn="0" w:oddVBand="0" w:evenVBand="0" w:oddHBand="1" w:evenHBand="0" w:firstRowFirstColumn="0" w:firstRowLastColumn="0" w:lastRowFirstColumn="0" w:lastRowLastColumn="0"/>
+              <w:rPr>
+                <w:lang w:val="en-IN"/>
+              </w:rPr>
+            </w:pPr>
+          </w:p>
+        </w:tc>
+        <w:tc>
+          <w:tcPr>
+            <w:tcW w:w="825" w:type="dxa"/>
+          </w:tcPr>
+          <w:p>
+            <w:pPr>
+              <w:jc w:val="center"/>
+              <w:cnfStyle w:val="000000100000" w:firstRow="0" w:lastRow="0" w:firstColumn="0" w:lastColumn="0" w:oddVBand="0" w:evenVBand="0" w:oddHBand="1" w:evenHBand="0" w:firstRowFirstColumn="0" w:firstRowLastColumn="0" w:lastRowFirstColumn="0" w:lastRowLastColumn="0"/>
+              <w:rPr>
+                <w:lang w:val="en-GB"/>
+              </w:rPr>
+            </w:pPr>
+            <w:r>
+              <w:rPr>
+                <w:noProof/>
+                <w:lang w:val="en-GB"/>
+              </w:rPr>
+              <w:drawing>
+                <wp:inline distT="0" distB="0" distL="0" distR="0" wp14:anchorId="17837981" wp14:editId="29D8F7A5">
+                  <wp:extent cx="190500" cy="190500"/>
+                  <wp:effectExtent l="0" t="0" r="0" b="0"/>
+                  <wp:docPr id="1467955614" name="Grafik 4" descr="Häkchen mit einfarbiger Füllung"/>
+                  <wp:cNvGraphicFramePr>
+                    <a:graphicFrameLocks xmlns:a="http://schemas.openxmlformats.org/drawingml/2006/main" noChangeAspect="1"/>
+                  </wp:cNvGraphicFramePr>
+                  <a:graphic xmlns:a="http://schemas.openxmlformats.org/drawingml/2006/main">
+                    <a:graphicData uri="http://schemas.openxmlformats.org/drawingml/2006/picture">
+                      <pic:pic xmlns:pic="http://schemas.openxmlformats.org/drawingml/2006/picture">
+                        <pic:nvPicPr>
+                          <pic:cNvPr id="39936774" name="Grafik 39936774" descr="Häkchen mit einfarbiger Füllung"/>
+                          <pic:cNvPicPr/>
+                        </pic:nvPicPr>
+                        <pic:blipFill>
+                          <a:blip r:embed="rId9" cstate="print">
+                            <a:extLst>
+                              <a:ext uri="{28A0092B-C50C-407E-A947-70E740481C1C}">
+                                <a14:useLocalDpi xmlns:a14="http://schemas.microsoft.com/office/drawing/2010/main" val="0"/>
+                              </a:ext>
+                              <a:ext uri="{96DAC541-7B7A-43D3-8B79-37D633B846F1}">
+                                <asvg:svgBlip xmlns:asvg="http://schemas.microsoft.com/office/drawing/2016/SVG/main" r:embed="rId10"/>
+                              </a:ext>
+                            </a:extLst>
+                          </a:blip>
+                          <a:stretch>
+                            <a:fillRect/>
+                          </a:stretch>
+                        </pic:blipFill>
+                        <pic:spPr>
+                          <a:xfrm>
+                            <a:off x="0" y="0"/>
+                            <a:ext cx="190500" cy="190500"/>
+                          </a:xfrm>
+                          <a:prstGeom prst="rect">
+                            <a:avLst/>
+                          </a:prstGeom>
+                        </pic:spPr>
+                      </pic:pic>
+                    </a:graphicData>
+                  </a:graphic>
+                </wp:inline>
+              </w:drawing>
+            </w:r>
+          </w:p>
+        </w:tc>
+        <w:tc>
+          <w:tcPr>
+            <w:tcW w:w="1059" w:type="dxa"/>
+          </w:tcPr>
+          <w:p>
+            <w:pPr>
+              <w:cnfStyle w:val="000000100000" w:firstRow="0" w:lastRow="0" w:firstColumn="0" w:lastColumn="0" w:oddVBand="0" w:evenVBand="0" w:oddHBand="1" w:evenHBand="0" w:firstRowFirstColumn="0" w:firstRowLastColumn="0" w:lastRowFirstColumn="0" w:lastRowLastColumn="0"/>
+              <w:rPr>
+                <w:lang w:val="en-GB"/>
+              </w:rPr>
+            </w:pPr>
+          </w:p>
+        </w:tc>
+        <w:tc>
+          <w:tcPr>
+            <w:tcW w:w="1546" w:type="dxa"/>
+          </w:tcPr>
+          <w:p>
+            <w:pPr>
+              <w:cnfStyle w:val="000000100000" w:firstRow="0" w:lastRow="0" w:firstColumn="0" w:lastColumn="0" w:oddVBand="0" w:evenVBand="0" w:oddHBand="1" w:evenHBand="0" w:firstRowFirstColumn="0" w:firstRowLastColumn="0" w:lastRowFirstColumn="0" w:lastRowLastColumn="0"/>
+              <w:rPr>
+                <w:lang w:val="en-GB"/>
+              </w:rPr>
+            </w:pPr>
+          </w:p>
+        </w:tc>
+      </w:tr>
+      <w:tr>
+        <w:tc>
+          <w:tcPr>
+            <w:cnfStyle w:val="001000000000" w:firstRow="0" w:lastRow="0" w:firstColumn="1" w:lastColumn="0" w:oddVBand="0" w:evenVBand="0" w:oddHBand="0" w:evenHBand="0" w:firstRowFirstColumn="0" w:firstRowLastColumn="0" w:lastRowFirstColumn="0" w:lastRowLastColumn="0"/>
+            <w:tcW w:w="832" w:type="dxa"/>
+          </w:tcPr>
+          <w:p>
+            <w:pPr>
+              <w:rPr>
+                <w:lang w:val="en-GB"/>
+              </w:rPr>
+            </w:pPr>
+            <w:r>
+              <w:rPr>
+                <w:lang w:val="en-GB"/>
+              </w:rPr>
+              <w:lastRenderedPageBreak/>
+              <w:t>T</w:t>
+            </w:r>
+            <w:r>
+              <w:rPr>
+                <w:lang w:val="en-GB"/>
+              </w:rPr>
+              <w:t>4</w:t>
+            </w:r>
+            <w:r>
+              <w:rPr>
+                <w:lang w:val="en-GB"/>
+              </w:rPr>
+              <w:t>.</w:t>
+            </w:r>
+            <w:r>
+              <w:rPr>
+                <w:lang w:val="en-GB"/>
+              </w:rPr>
+              <w:t>2</w:t>
+            </w:r>
+          </w:p>
+        </w:tc>
+        <w:tc>
+          <w:tcPr>
+            <w:tcW w:w="2145" w:type="dxa"/>
+          </w:tcPr>
+          <w:p>
+            <w:pPr>
+              <w:cnfStyle w:val="000000000000" w:firstRow="0" w:lastRow="0" w:firstColumn="0" w:lastColumn="0" w:oddVBand="0" w:evenVBand="0" w:oddHBand="0" w:evenHBand="0" w:firstRowFirstColumn="0" w:firstRowLastColumn="0" w:lastRowFirstColumn="0" w:lastRowLastColumn="0"/>
+              <w:rPr>
+                <w:lang w:val="en-IN"/>
+              </w:rPr>
+            </w:pPr>
+            <w:r>
+              <w:rPr>
+                <w:lang w:val="en-IN"/>
+              </w:rPr>
+              <w:t>I exported and finalized the DMP as the final PDF/PDF-A version.</w:t>
+            </w:r>
+          </w:p>
+        </w:tc>
+        <w:tc>
+          <w:tcPr>
+            <w:tcW w:w="2665" w:type="dxa"/>
+          </w:tcPr>
+          <w:p>
+            <w:pPr>
+              <w:cnfStyle w:val="000000000000" w:firstRow="0" w:lastRow="0" w:firstColumn="0" w:lastColumn="0" w:oddVBand="0" w:evenVBand="0" w:oddHBand="0" w:evenHBand="0" w:firstRowFirstColumn="0" w:firstRowLastColumn="0" w:lastRowFirstColumn="0" w:lastRowLastColumn="0"/>
+              <w:rPr>
+                <w:lang w:val="en-GB"/>
+              </w:rPr>
+            </w:pPr>
+            <w:r>
+              <w:rPr>
+                <w:lang w:val="en-GB"/>
+              </w:rPr>
+              <w:t>https://github.com/e12436439/Data-Stewardship-UE-2026S/commit/a662b387cfafe7787795ba308171d64a4a96ffbc</w:t>
+            </w:r>
+          </w:p>
+        </w:tc>
+        <w:tc>
+          <w:tcPr>
+            <w:tcW w:w="825" w:type="dxa"/>
+          </w:tcPr>
+          <w:p>
+            <w:pPr>
+              <w:jc w:val="center"/>
+              <w:cnfStyle w:val="000000000000" w:firstRow="0" w:lastRow="0" w:firstColumn="0" w:lastColumn="0" w:oddVBand="0" w:evenVBand="0" w:oddHBand="0" w:evenHBand="0" w:firstRowFirstColumn="0" w:firstRowLastColumn="0" w:lastRowFirstColumn="0" w:lastRowLastColumn="0"/>
+              <w:rPr>
+                <w:lang w:val="en-GB"/>
+              </w:rPr>
+            </w:pPr>
+            <w:r>
+              <w:rPr>
+                <w:noProof/>
+                <w:lang w:val="en-GB"/>
+              </w:rPr>
+              <w:drawing>
+                <wp:inline distT="0" distB="0" distL="0" distR="0" wp14:anchorId="03A14E1C" wp14:editId="5E3E417E">
+                  <wp:extent cx="190500" cy="190500"/>
+                  <wp:effectExtent l="0" t="0" r="0" b="0"/>
+                  <wp:docPr id="100706525" name="Grafik 4" descr="Häkchen mit einfarbiger Füllung"/>
+                  <wp:cNvGraphicFramePr>
+                    <a:graphicFrameLocks xmlns:a="http://schemas.openxmlformats.org/drawingml/2006/main" noChangeAspect="1"/>
+                  </wp:cNvGraphicFramePr>
+                  <a:graphic xmlns:a="http://schemas.openxmlformats.org/drawingml/2006/main">
+                    <a:graphicData uri="http://schemas.openxmlformats.org/drawingml/2006/picture">
+                      <pic:pic xmlns:pic="http://schemas.openxmlformats.org/drawingml/2006/picture">
+                        <pic:nvPicPr>
+                          <pic:cNvPr id="39936774" name="Grafik 39936774" descr="Häkchen mit einfarbiger Füllung"/>
+                          <pic:cNvPicPr/>
+                        </pic:nvPicPr>
+                        <pic:blipFill>
+                          <a:blip r:embed="rId9" cstate="print">
+                            <a:extLst>
+                              <a:ext uri="{28A0092B-C50C-407E-A947-70E740481C1C}">
+                                <a14:useLocalDpi xmlns:a14="http://schemas.microsoft.com/office/drawing/2010/main" val="0"/>
+                              </a:ext>
+                              <a:ext uri="{96DAC541-7B7A-43D3-8B79-37D633B846F1}">
+                                <asvg:svgBlip xmlns:asvg="http://schemas.microsoft.com/office/drawing/2016/SVG/main" r:embed="rId10"/>
+                              </a:ext>
+                            </a:extLst>
+                          </a:blip>
+                          <a:stretch>
+                            <a:fillRect/>
+                          </a:stretch>
+                        </pic:blipFill>
+                        <pic:spPr>
+                          <a:xfrm>
+                            <a:off x="0" y="0"/>
+                            <a:ext cx="190500" cy="190500"/>
+                          </a:xfrm>
+                          <a:prstGeom prst="rect">
+                            <a:avLst/>
+                          </a:prstGeom>
+                        </pic:spPr>
+                      </pic:pic>
+                    </a:graphicData>
+                  </a:graphic>
+                </wp:inline>
+              </w:drawing>
+            </w:r>
+          </w:p>
+        </w:tc>
+        <w:tc>
+          <w:tcPr>
+            <w:tcW w:w="1059" w:type="dxa"/>
+          </w:tcPr>
+          <w:p>
+            <w:pPr>
+              <w:cnfStyle w:val="000000000000" w:firstRow="0" w:lastRow="0" w:firstColumn="0" w:lastColumn="0" w:oddVBand="0" w:evenVBand="0" w:oddHBand="0" w:evenHBand="0" w:firstRowFirstColumn="0" w:firstRowLastColumn="0" w:lastRowFirstColumn="0" w:lastRowLastColumn="0"/>
+              <w:rPr>
+                <w:lang w:val="en-GB"/>
+              </w:rPr>
+            </w:pPr>
+          </w:p>
+        </w:tc>
+        <w:tc>
+          <w:tcPr>
+            <w:tcW w:w="1546" w:type="dxa"/>
+          </w:tcPr>
+          <w:p>
+            <w:pPr>
+              <w:cnfStyle w:val="000000000000" w:firstRow="0" w:lastRow="0" w:firstColumn="0" w:lastColumn="0" w:oddVBand="0" w:evenVBand="0" w:oddHBand="0" w:evenHBand="0" w:firstRowFirstColumn="0" w:firstRowLastColumn="0" w:lastRowFirstColumn="0" w:lastRowLastColumn="0"/>
+              <w:rPr>
+                <w:lang w:val="en-GB"/>
+              </w:rPr>
+            </w:pPr>
+          </w:p>
+        </w:tc>
+      </w:tr>
+      <w:tr>
+        <w:trPr>
+          <w:cnfStyle w:val="000000100000" w:firstRow="0" w:lastRow="0" w:firstColumn="0" w:lastColumn="0" w:oddVBand="0" w:evenVBand="0" w:oddHBand="1" w:evenHBand="0" w:firstRowFirstColumn="0" w:firstRowLastColumn="0" w:lastRowFirstColumn="0" w:lastRowLastColumn="0"/>
+        </w:trPr>
+        <w:tc>
+          <w:tcPr>
+            <w:cnfStyle w:val="001000000000" w:firstRow="0" w:lastRow="0" w:firstColumn="1" w:lastColumn="0" w:oddVBand="0" w:evenVBand="0" w:oddHBand="0" w:evenHBand="0" w:firstRowFirstColumn="0" w:firstRowLastColumn="0" w:lastRowFirstColumn="0" w:lastRowLastColumn="0"/>
+            <w:tcW w:w="832" w:type="dxa"/>
+          </w:tcPr>
+          <w:p>
+            <w:pPr>
+              <w:rPr>
+                <w:lang w:val="en-GB"/>
+              </w:rPr>
+            </w:pPr>
+            <w:r>
+              <w:rPr>
+                <w:lang w:val="en-GB"/>
+              </w:rPr>
+              <w:t>T</w:t>
+            </w:r>
+            <w:r>
+              <w:rPr>
+                <w:lang w:val="en-GB"/>
+              </w:rPr>
+              <w:t>5.5</w:t>
+            </w:r>
+          </w:p>
+        </w:tc>
+        <w:tc>
+          <w:tcPr>
+            <w:tcW w:w="2145" w:type="dxa"/>
+          </w:tcPr>
+          <w:p>
+            <w:pPr>
+              <w:cnfStyle w:val="000000100000" w:firstRow="0" w:lastRow="0" w:firstColumn="0" w:lastColumn="0" w:oddVBand="0" w:evenVBand="0" w:oddHBand="1" w:evenHBand="0" w:firstRowFirstColumn="0" w:firstRowLastColumn="0" w:lastRowFirstColumn="0" w:lastRowLastColumn="0"/>
+              <w:rPr>
+                <w:lang w:val="en-IN"/>
+              </w:rPr>
+            </w:pPr>
+            <w:r>
+              <w:rPr>
+                <w:lang w:val="en-IN"/>
+              </w:rPr>
+              <w:t xml:space="preserve">I implemented the </w:t>
+            </w:r>
+            <w:proofErr w:type="spellStart"/>
+            <w:r>
+              <w:rPr>
+                <w:lang w:val="en-IN"/>
+              </w:rPr>
+              <w:t>OSTrails</w:t>
+            </w:r>
+            <w:proofErr w:type="spellEnd"/>
+            <w:r>
+              <w:rPr>
+                <w:lang w:val="en-IN"/>
+              </w:rPr>
+              <w:t xml:space="preserve"> tests assigned</w:t>
+            </w:r>
+            <w:r>
+              <w:rPr>
+                <w:lang w:val="en-IN"/>
+              </w:rPr>
+              <w:t xml:space="preserve"> </w:t>
+            </w:r>
+            <w:r>
+              <w:rPr>
+                <w:lang w:val="en-IN"/>
+              </w:rPr>
+              <w:t>(1,16,32)</w:t>
+            </w:r>
+          </w:p>
+        </w:tc>
+        <w:tc>
+          <w:tcPr>
+            <w:tcW w:w="2665" w:type="dxa"/>
+          </w:tcPr>
+          <w:p>
+            <w:pPr>
+              <w:cnfStyle w:val="000000100000" w:firstRow="0" w:lastRow="0" w:firstColumn="0" w:lastColumn="0" w:oddVBand="0" w:evenVBand="0" w:oddHBand="1" w:evenHBand="0" w:firstRowFirstColumn="0" w:firstRowLastColumn="0" w:lastRowFirstColumn="0" w:lastRowLastColumn="0"/>
+              <w:rPr>
+                <w:lang w:val="en-GB"/>
+              </w:rPr>
+            </w:pPr>
+            <w:r>
+              <w:rPr>
+                <w:lang w:val="en-GB"/>
+              </w:rPr>
+              <w:t>https://gitlab.tuwien.ac.at/e52308278/dast-2026-ue/-/commit/058d19b5655566dd0fb7d7e47463773988b4d842</w:t>
+            </w:r>
+          </w:p>
+        </w:tc>
+        <w:tc>
+          <w:tcPr>
+            <w:tcW w:w="825" w:type="dxa"/>
+          </w:tcPr>
+          <w:p>
+            <w:pPr>
+              <w:jc w:val="center"/>
+              <w:cnfStyle w:val="000000100000" w:firstRow="0" w:lastRow="0" w:firstColumn="0" w:lastColumn="0" w:oddVBand="0" w:evenVBand="0" w:oddHBand="1" w:evenHBand="0" w:firstRowFirstColumn="0" w:firstRowLastColumn="0" w:lastRowFirstColumn="0" w:lastRowLastColumn="0"/>
+              <w:rPr>
+                <w:lang w:val="en-GB"/>
+              </w:rPr>
+            </w:pPr>
+            <w:r>
+              <w:rPr>
+                <w:noProof/>
+                <w:lang w:val="en-GB"/>
+              </w:rPr>
+              <w:drawing>
+                <wp:inline distT="0" distB="0" distL="0" distR="0" wp14:anchorId="156356E4" wp14:editId="1F0933AF">
+                  <wp:extent cx="190500" cy="190500"/>
+                  <wp:effectExtent l="0" t="0" r="0" b="0"/>
+                  <wp:docPr id="144614888" name="Grafik 4" descr="Häkchen mit einfarbiger Füllung"/>
+                  <wp:cNvGraphicFramePr>
+                    <a:graphicFrameLocks xmlns:a="http://schemas.openxmlformats.org/drawingml/2006/main" noChangeAspect="1"/>
+                  </wp:cNvGraphicFramePr>
+                  <a:graphic xmlns:a="http://schemas.openxmlformats.org/drawingml/2006/main">
+                    <a:graphicData uri="http://schemas.openxmlformats.org/drawingml/2006/picture">
+                      <pic:pic xmlns:pic="http://schemas.openxmlformats.org/drawingml/2006/picture">
+                        <pic:nvPicPr>
+                          <pic:cNvPr id="39936774" name="Grafik 39936774" descr="Häkchen mit einfarbiger Füllung"/>
+                          <pic:cNvPicPr/>
+                        </pic:nvPicPr>
+                        <pic:blipFill>
+                          <a:blip r:embed="rId9" cstate="print">
+                            <a:extLst>
+                              <a:ext uri="{28A0092B-C50C-407E-A947-70E740481C1C}">
+                                <a14:useLocalDpi xmlns:a14="http://schemas.microsoft.com/office/drawing/2010/main" val="0"/>
+                              </a:ext>
+                              <a:ext uri="{96DAC541-7B7A-43D3-8B79-37D633B846F1}">
+                                <asvg:svgBlip xmlns:asvg="http://schemas.microsoft.com/office/drawing/2016/SVG/main" r:embed="rId10"/>
+                              </a:ext>
+                            </a:extLst>
+                          </a:blip>
+                          <a:stretch>
+                            <a:fillRect/>
+                          </a:stretch>
+                        </pic:blipFill>
+                        <pic:spPr>
+                          <a:xfrm>
+                            <a:off x="0" y="0"/>
+                            <a:ext cx="190500" cy="190500"/>
+                          </a:xfrm>
+                          <a:prstGeom prst="rect">
+                            <a:avLst/>
+                          </a:prstGeom>
+                        </pic:spPr>
+                      </pic:pic>
+                    </a:graphicData>
+                  </a:graphic>
+                </wp:inline>
+              </w:drawing>
+            </w:r>
+          </w:p>
+        </w:tc>
+        <w:tc>
+          <w:tcPr>
+            <w:tcW w:w="1059" w:type="dxa"/>
+          </w:tcPr>
+          <w:p>
+            <w:pPr>
+              <w:cnfStyle w:val="000000100000" w:firstRow="0" w:lastRow="0" w:firstColumn="0" w:lastColumn="0" w:oddVBand="0" w:evenVBand="0" w:oddHBand="1" w:evenHBand="0" w:firstRowFirstColumn="0" w:firstRowLastColumn="0" w:lastRowFirstColumn="0" w:lastRowLastColumn="0"/>
+              <w:rPr>
+                <w:lang w:val="en-GB"/>
+              </w:rPr>
+            </w:pPr>
+          </w:p>
+        </w:tc>
+        <w:tc>
+          <w:tcPr>
+            <w:tcW w:w="1546" w:type="dxa"/>
+          </w:tcPr>
+          <w:p>
+            <w:pPr>
+              <w:cnfStyle w:val="000000100000" w:firstRow="0" w:lastRow="0" w:firstColumn="0" w:lastColumn="0" w:oddVBand="0" w:evenVBand="0" w:oddHBand="1" w:evenHBand="0" w:firstRowFirstColumn="0" w:firstRowLastColumn="0" w:lastRowFirstColumn="0" w:lastRowLastColumn="0"/>
+              <w:rPr>
+                <w:lang w:val="en-GB"/>
+              </w:rPr>
+            </w:pPr>
+          </w:p>
+        </w:tc>
+      </w:tr>
+      <w:tr>
+        <w:tc>
+          <w:tcPr>
+            <w:cnfStyle w:val="001000000000" w:firstRow="0" w:lastRow="0" w:firstColumn="1" w:lastColumn="0" w:oddVBand="0" w:evenVBand="0" w:oddHBand="0" w:evenHBand="0" w:firstRowFirstColumn="0" w:firstRowLastColumn="0" w:lastRowFirstColumn="0" w:lastRowLastColumn="0"/>
+            <w:tcW w:w="832" w:type="dxa"/>
+          </w:tcPr>
+          <w:p>
+            <w:pPr>
+              <w:rPr>
+                <w:lang w:val="en-GB"/>
+              </w:rPr>
+            </w:pPr>
+            <w:r>
+              <w:rPr>
+                <w:lang w:val="en-GB"/>
+              </w:rPr>
+              <w:t>T6.1</w:t>
+            </w:r>
+          </w:p>
+        </w:tc>
+        <w:tc>
+          <w:tcPr>
+            <w:tcW w:w="2145" w:type="dxa"/>
+          </w:tcPr>
+          <w:p>
+            <w:pPr>
+              <w:cnfStyle w:val="000000000000" w:firstRow="0" w:lastRow="0" w:firstColumn="0" w:lastColumn="0" w:oddVBand="0" w:evenVBand="0" w:oddHBand="0" w:evenHBand="0" w:firstRowFirstColumn="0" w:firstRowLastColumn="0" w:lastRowFirstColumn="0" w:lastRowLastColumn="0"/>
+              <w:rPr>
+                <w:lang w:val="en-GB"/>
+              </w:rPr>
+            </w:pPr>
+            <w:r>
+              <w:rPr>
+                <w:lang w:val="en-IN"/>
+              </w:rPr>
+              <w:t xml:space="preserve">I checked Group 4’s artefacts, including </w:t>
+            </w:r>
+            <w:proofErr w:type="spellStart"/>
+            <w:r>
+              <w:rPr>
+                <w:lang w:val="en-IN"/>
+              </w:rPr>
+              <w:t>DBRepo</w:t>
+            </w:r>
+            <w:proofErr w:type="spellEnd"/>
+            <w:r>
+              <w:rPr>
+                <w:lang w:val="en-IN"/>
+              </w:rPr>
+              <w:t xml:space="preserve">, GitHub, </w:t>
+            </w:r>
+            <w:proofErr w:type="spellStart"/>
+            <w:r>
+              <w:rPr>
+                <w:lang w:val="en-IN"/>
+              </w:rPr>
+              <w:t>Zenodo</w:t>
+            </w:r>
+            <w:proofErr w:type="spellEnd"/>
+            <w:r>
+              <w:rPr>
+                <w:lang w:val="en-IN"/>
+              </w:rPr>
+              <w:t xml:space="preserve">, DMP and DOI </w:t>
+            </w:r>
+            <w:proofErr w:type="gramStart"/>
+            <w:r>
+              <w:rPr>
+                <w:lang w:val="en-IN"/>
+              </w:rPr>
+              <w:t>links.</w:t>
+            </w:r>
+            <w:r>
+              <w:rPr>
+                <w:lang w:val="en-GB"/>
+              </w:rPr>
+              <w:t>.</w:t>
+            </w:r>
+            <w:proofErr w:type="gramEnd"/>
+          </w:p>
+        </w:tc>
+        <w:tc>
+          <w:tcPr>
+            <w:tcW w:w="2665" w:type="dxa"/>
+          </w:tcPr>
+          <w:p>
+            <w:pPr>
+              <w:cnfStyle w:val="000000000000" w:firstRow="0" w:lastRow="0" w:firstColumn="0" w:lastColumn="0" w:oddVBand="0" w:evenVBand="0" w:oddHBand="0" w:evenHBand="0" w:firstRowFirstColumn="0" w:firstRowLastColumn="0" w:lastRowFirstColumn="0" w:lastRowLastColumn="0"/>
+              <w:rPr>
+                <w:lang w:val="en-GB"/>
+              </w:rPr>
+            </w:pPr>
+          </w:p>
+        </w:tc>
+        <w:tc>
+          <w:tcPr>
+            <w:tcW w:w="825" w:type="dxa"/>
+          </w:tcPr>
+          <w:p>
+            <w:pPr>
+              <w:jc w:val="center"/>
+              <w:cnfStyle w:val="000000000000" w:firstRow="0" w:lastRow="0" w:firstColumn="0" w:lastColumn="0" w:oddVBand="0" w:evenVBand="0" w:oddHBand="0" w:evenHBand="0" w:firstRowFirstColumn="0" w:firstRowLastColumn="0" w:lastRowFirstColumn="0" w:lastRowLastColumn="0"/>
+              <w:rPr>
+                <w:lang w:val="en-GB"/>
+              </w:rPr>
+            </w:pPr>
+            <w:r>
+              <w:rPr>
+                <w:noProof/>
+                <w:lang w:val="en-GB"/>
+              </w:rPr>
+              <w:drawing>
+                <wp:inline distT="0" distB="0" distL="0" distR="0" wp14:anchorId="558651D0" wp14:editId="1CFD7267">
+                  <wp:extent cx="190500" cy="190500"/>
+                  <wp:effectExtent l="0" t="0" r="0" b="0"/>
+                  <wp:docPr id="1401929007" name="Grafik 4" descr="Häkchen mit einfarbiger Füllung"/>
+                  <wp:cNvGraphicFramePr>
+                    <a:graphicFrameLocks xmlns:a="http://schemas.openxmlformats.org/drawingml/2006/main" noChangeAspect="1"/>
+                  </wp:cNvGraphicFramePr>
+                  <a:graphic xmlns:a="http://schemas.openxmlformats.org/drawingml/2006/main">
+                    <a:graphicData uri="http://schemas.openxmlformats.org/drawingml/2006/picture">
+                      <pic:pic xmlns:pic="http://schemas.openxmlformats.org/drawingml/2006/picture">
+                        <pic:nvPicPr>
+                          <pic:cNvPr id="39936774" name="Grafik 39936774" descr="Häkchen mit einfarbiger Füllung"/>
+                          <pic:cNvPicPr/>
+                        </pic:nvPicPr>
+                        <pic:blipFill>
+                          <a:blip r:embed="rId9" cstate="print">
+                            <a:extLst>
+                              <a:ext uri="{28A0092B-C50C-407E-A947-70E740481C1C}">
+                                <a14:useLocalDpi xmlns:a14="http://schemas.microsoft.com/office/drawing/2010/main" val="0"/>
+                              </a:ext>
+                              <a:ext uri="{96DAC541-7B7A-43D3-8B79-37D633B846F1}">
+                                <asvg:svgBlip xmlns:asvg="http://schemas.microsoft.com/office/drawing/2016/SVG/main" r:embed="rId10"/>
+                              </a:ext>
+                            </a:extLst>
+                          </a:blip>
+                          <a:stretch>
+                            <a:fillRect/>
+                          </a:stretch>
+                        </pic:blipFill>
+                        <pic:spPr>
+                          <a:xfrm>
+                            <a:off x="0" y="0"/>
+                            <a:ext cx="190500" cy="190500"/>
+                          </a:xfrm>
+                          <a:prstGeom prst="rect">
+                            <a:avLst/>
+                          </a:prstGeom>
+                        </pic:spPr>
+                      </pic:pic>
+                    </a:graphicData>
+                  </a:graphic>
+                </wp:inline>
+              </w:drawing>
+            </w:r>
+          </w:p>
+        </w:tc>
+        <w:tc>
+          <w:tcPr>
+            <w:tcW w:w="1059" w:type="dxa"/>
+          </w:tcPr>
+          <w:p>
+            <w:pPr>
+              <w:cnfStyle w:val="000000000000" w:firstRow="0" w:lastRow="0" w:firstColumn="0" w:lastColumn="0" w:oddVBand="0" w:evenVBand="0" w:oddHBand="0" w:evenHBand="0" w:firstRowFirstColumn="0" w:firstRowLastColumn="0" w:lastRowFirstColumn="0" w:lastRowLastColumn="0"/>
+              <w:rPr>
+                <w:lang w:val="en-GB"/>
+              </w:rPr>
+            </w:pPr>
+          </w:p>
+        </w:tc>
+        <w:tc>
+          <w:tcPr>
+            <w:tcW w:w="1546" w:type="dxa"/>
+          </w:tcPr>
+          <w:p>
+            <w:pPr>
+              <w:cnfStyle w:val="000000000000" w:firstRow="0" w:lastRow="0" w:firstColumn="0" w:lastColumn="0" w:oddVBand="0" w:evenVBand="0" w:oddHBand="0" w:evenHBand="0" w:firstRowFirstColumn="0" w:firstRowLastColumn="0" w:lastRowFirstColumn="0" w:lastRowLastColumn="0"/>
+              <w:rPr>
+                <w:lang w:val="en-GB"/>
+              </w:rPr>
+            </w:pPr>
+          </w:p>
+        </w:tc>
+      </w:tr>
+      <w:tr>
+        <w:trPr>
+          <w:cnfStyle w:val="000000100000" w:firstRow="0" w:lastRow="0" w:firstColumn="0" w:lastColumn="0" w:oddVBand="0" w:evenVBand="0" w:oddHBand="1" w:evenHBand="0" w:firstRowFirstColumn="0" w:firstRowLastColumn="0" w:lastRowFirstColumn="0" w:lastRowLastColumn="0"/>
+        </w:trPr>
+        <w:tc>
+          <w:tcPr>
+            <w:cnfStyle w:val="001000000000" w:firstRow="0" w:lastRow="0" w:firstColumn="1" w:lastColumn="0" w:oddVBand="0" w:evenVBand="0" w:oddHBand="0" w:evenHBand="0" w:firstRowFirstColumn="0" w:firstRowLastColumn="0" w:lastRowFirstColumn="0" w:lastRowLastColumn="0"/>
+            <w:tcW w:w="832" w:type="dxa"/>
+          </w:tcPr>
+          <w:p>
+            <w:pPr>
+              <w:rPr>
+                <w:lang w:val="en-GB"/>
+              </w:rPr>
+            </w:pPr>
+            <w:r>
+              <w:rPr>
+                <w:lang w:val="en-GB"/>
+              </w:rPr>
+              <w:t>T6.2</w:t>
+            </w:r>
+          </w:p>
+        </w:tc>
+        <w:tc>
+          <w:tcPr>
+            <w:tcW w:w="2145" w:type="dxa"/>
+          </w:tcPr>
+          <w:p>
+            <w:pPr>
+              <w:cnfStyle w:val="000000100000" w:firstRow="0" w:lastRow="0" w:firstColumn="0" w:lastColumn="0" w:oddVBand="0" w:evenVBand="0" w:oddHBand="1" w:evenHBand="0" w:firstRowFirstColumn="0" w:firstRowLastColumn="0" w:lastRowFirstColumn="0" w:lastRowLastColumn="0"/>
+              <w:rPr>
+                <w:lang w:val="en-IN"/>
+              </w:rPr>
+            </w:pPr>
+            <w:r>
+              <w:rPr>
+                <w:lang w:val="en-IN"/>
+              </w:rPr>
+              <w:t>I contributed findings to the Group 4 review report.</w:t>
+            </w:r>
+          </w:p>
+        </w:tc>
+        <w:tc>
+          <w:tcPr>
+            <w:tcW w:w="2665" w:type="dxa"/>
+          </w:tcPr>
+          <w:p>
+            <w:pPr>
+              <w:cnfStyle w:val="000000100000" w:firstRow="0" w:lastRow="0" w:firstColumn="0" w:lastColumn="0" w:oddVBand="0" w:evenVBand="0" w:oddHBand="1" w:evenHBand="0" w:firstRowFirstColumn="0" w:firstRowLastColumn="0" w:lastRowFirstColumn="0" w:lastRowLastColumn="0"/>
+              <w:rPr>
+                <w:lang w:val="en-GB"/>
+              </w:rPr>
+            </w:pPr>
+          </w:p>
+        </w:tc>
+        <w:tc>
+          <w:tcPr>
+            <w:tcW w:w="825" w:type="dxa"/>
+          </w:tcPr>
+          <w:p>
+            <w:pPr>
+              <w:jc w:val="center"/>
+              <w:cnfStyle w:val="000000100000" w:firstRow="0" w:lastRow="0" w:firstColumn="0" w:lastColumn="0" w:oddVBand="0" w:evenVBand="0" w:oddHBand="1" w:evenHBand="0" w:firstRowFirstColumn="0" w:firstRowLastColumn="0" w:lastRowFirstColumn="0" w:lastRowLastColumn="0"/>
+              <w:rPr>
+                <w:lang w:val="en-GB"/>
+              </w:rPr>
+            </w:pPr>
+            <w:r>
+              <w:rPr>
+                <w:noProof/>
+                <w:lang w:val="en-GB"/>
+              </w:rPr>
+              <w:drawing>
+                <wp:inline distT="0" distB="0" distL="0" distR="0" wp14:anchorId="421AAB17" wp14:editId="14226ABF">
+                  <wp:extent cx="190500" cy="190500"/>
+                  <wp:effectExtent l="0" t="0" r="0" b="0"/>
+                  <wp:docPr id="63339644" name="Grafik 4" descr="Häkchen mit einfarbiger Füllung"/>
+                  <wp:cNvGraphicFramePr>
+                    <a:graphicFrameLocks xmlns:a="http://schemas.openxmlformats.org/drawingml/2006/main" noChangeAspect="1"/>
+                  </wp:cNvGraphicFramePr>
+                  <a:graphic xmlns:a="http://schemas.openxmlformats.org/drawingml/2006/main">
+                    <a:graphicData uri="http://schemas.openxmlformats.org/drawingml/2006/picture">
+                      <pic:pic xmlns:pic="http://schemas.openxmlformats.org/drawingml/2006/picture">
+                        <pic:nvPicPr>
+                          <pic:cNvPr id="39936774" name="Grafik 39936774" descr="Häkchen mit einfarbiger Füllung"/>
+                          <pic:cNvPicPr/>
+                        </pic:nvPicPr>
+                        <pic:blipFill>
+                          <a:blip r:embed="rId9" cstate="print">
+                            <a:extLst>
+                              <a:ext uri="{28A0092B-C50C-407E-A947-70E740481C1C}">
+                                <a14:useLocalDpi xmlns:a14="http://schemas.microsoft.com/office/drawing/2010/main" val="0"/>
+                              </a:ext>
+                              <a:ext uri="{96DAC541-7B7A-43D3-8B79-37D633B846F1}">
+                                <asvg:svgBlip xmlns:asvg="http://schemas.microsoft.com/office/drawing/2016/SVG/main" r:embed="rId10"/>
+                              </a:ext>
+                            </a:extLst>
+                          </a:blip>
+                          <a:stretch>
+                            <a:fillRect/>
+                          </a:stretch>
+                        </pic:blipFill>
+                        <pic:spPr>
+                          <a:xfrm>
+                            <a:off x="0" y="0"/>
+                            <a:ext cx="190500" cy="190500"/>
+                          </a:xfrm>
+                          <a:prstGeom prst="rect">
+                            <a:avLst/>
+                          </a:prstGeom>
+                        </pic:spPr>
+                      </pic:pic>
+                    </a:graphicData>
+                  </a:graphic>
+                </wp:inline>
+              </w:drawing>
+            </w:r>
+          </w:p>
+        </w:tc>
+        <w:tc>
+          <w:tcPr>
+            <w:tcW w:w="1059" w:type="dxa"/>
+          </w:tcPr>
+          <w:p>
+            <w:pPr>
+              <w:cnfStyle w:val="000000100000" w:firstRow="0" w:lastRow="0" w:firstColumn="0" w:lastColumn="0" w:oddVBand="0" w:evenVBand="0" w:oddHBand="1" w:evenHBand="0" w:firstRowFirstColumn="0" w:firstRowLastColumn="0" w:lastRowFirstColumn="0" w:lastRowLastColumn="0"/>
+              <w:rPr>
+                <w:lang w:val="en-GB"/>
+              </w:rPr>
+            </w:pPr>
+          </w:p>
+        </w:tc>
+        <w:tc>
+          <w:tcPr>
+            <w:tcW w:w="1546" w:type="dxa"/>
+          </w:tcPr>
+          <w:p>
+            <w:pPr>
+              <w:cnfStyle w:val="000000100000" w:firstRow="0" w:lastRow="0" w:firstColumn="0" w:lastColumn="0" w:oddVBand="0" w:evenVBand="0" w:oddHBand="1" w:evenHBand="0" w:firstRowFirstColumn="0" w:firstRowLastColumn="0" w:lastRowFirstColumn="0" w:lastRowLastColumn="0"/>
+              <w:rPr>
+                <w:lang w:val="en-GB"/>
+              </w:rPr>
+            </w:pPr>
+          </w:p>
+        </w:tc>
+      </w:tr>
+      <w:tr>
+        <w:tc>
+          <w:tcPr>
+            <w:cnfStyle w:val="001000000000" w:firstRow="0" w:lastRow="0" w:firstColumn="1" w:lastColumn="0" w:oddVBand="0" w:evenVBand="0" w:oddHBand="0" w:evenHBand="0" w:firstRowFirstColumn="0" w:firstRowLastColumn="0" w:lastRowFirstColumn="0" w:lastRowLastColumn="0"/>
+            <w:tcW w:w="832" w:type="dxa"/>
+          </w:tcPr>
+          <w:p>
+            <w:pPr>
+              <w:rPr>
+                <w:lang w:val="en-GB"/>
+              </w:rPr>
+            </w:pPr>
+            <w:r>
+              <w:rPr>
+                <w:lang w:val="en-GB"/>
+              </w:rPr>
+              <w:t>T7.1</w:t>
+            </w:r>
+          </w:p>
+        </w:tc>
+        <w:tc>
+          <w:tcPr>
+            <w:tcW w:w="2145" w:type="dxa"/>
+          </w:tcPr>
+          <w:p>
+            <w:pPr>
+              <w:cnfStyle w:val="000000000000" w:firstRow="0" w:lastRow="0" w:firstColumn="0" w:lastColumn="0" w:oddVBand="0" w:evenVBand="0" w:oddHBand="0" w:evenHBand="0" w:firstRowFirstColumn="0" w:firstRowLastColumn="0" w:lastRowFirstColumn="0" w:lastRowLastColumn="0"/>
+              <w:rPr>
+                <w:lang w:val="en-IN"/>
+              </w:rPr>
+            </w:pPr>
+            <w:r>
+              <w:rPr>
+                <w:lang w:val="en-IN"/>
+              </w:rPr>
+              <w:t>I checked the final report structure and prepared my sign-off table.</w:t>
+            </w:r>
+          </w:p>
+        </w:tc>
+        <w:tc>
+          <w:tcPr>
+            <w:tcW w:w="2665" w:type="dxa"/>
+          </w:tcPr>
+          <w:p>
+            <w:pPr>
+              <w:cnfStyle w:val="000000000000" w:firstRow="0" w:lastRow="0" w:firstColumn="0" w:lastColumn="0" w:oddVBand="0" w:evenVBand="0" w:oddHBand="0" w:evenHBand="0" w:firstRowFirstColumn="0" w:firstRowLastColumn="0" w:lastRowFirstColumn="0" w:lastRowLastColumn="0"/>
+              <w:rPr>
+                <w:lang w:val="en-GB"/>
+              </w:rPr>
+            </w:pPr>
+            <w:r>
+              <w:rPr>
+                <w:lang w:val="en-GB"/>
+              </w:rPr>
+              <w:t>https://github.com/e12436439/Data-Stewardship-UE-2026S/blob/main/docs/final_report_20260622.docx</w:t>
+            </w:r>
+          </w:p>
+        </w:tc>
+        <w:tc>
+          <w:tcPr>
+            <w:tcW w:w="825" w:type="dxa"/>
+          </w:tcPr>
+          <w:p>
+            <w:pPr>
+              <w:jc w:val="center"/>
+              <w:cnfStyle w:val="000000000000" w:firstRow="0" w:lastRow="0" w:firstColumn="0" w:lastColumn="0" w:oddVBand="0" w:evenVBand="0" w:oddHBand="0" w:evenHBand="0" w:firstRowFirstColumn="0" w:firstRowLastColumn="0" w:lastRowFirstColumn="0" w:lastRowLastColumn="0"/>
+              <w:rPr>
+                <w:lang w:val="en-GB"/>
+              </w:rPr>
+            </w:pPr>
+            <w:r>
+              <w:rPr>
+                <w:noProof/>
+                <w:lang w:val="en-GB"/>
+              </w:rPr>
+              <w:drawing>
+                <wp:inline distT="0" distB="0" distL="0" distR="0" wp14:anchorId="0765EF9E" wp14:editId="6CA625C9">
+                  <wp:extent cx="190500" cy="190500"/>
+                  <wp:effectExtent l="0" t="0" r="0" b="0"/>
+                  <wp:docPr id="1252682739" name="Grafik 4" descr="Häkchen mit einfarbiger Füllung"/>
+                  <wp:cNvGraphicFramePr>
+                    <a:graphicFrameLocks xmlns:a="http://schemas.openxmlformats.org/drawingml/2006/main" noChangeAspect="1"/>
+                  </wp:cNvGraphicFramePr>
+                  <a:graphic xmlns:a="http://schemas.openxmlformats.org/drawingml/2006/main">
+                    <a:graphicData uri="http://schemas.openxmlformats.org/drawingml/2006/picture">
+                      <pic:pic xmlns:pic="http://schemas.openxmlformats.org/drawingml/2006/picture">
+                        <pic:nvPicPr>
+                          <pic:cNvPr id="39936774" name="Grafik 39936774" descr="Häkchen mit einfarbiger Füllung"/>
+                          <pic:cNvPicPr/>
+                        </pic:nvPicPr>
+                        <pic:blipFill>
+                          <a:blip r:embed="rId9" cstate="print">
+                            <a:extLst>
+                              <a:ext uri="{28A0092B-C50C-407E-A947-70E740481C1C}">
+                                <a14:useLocalDpi xmlns:a14="http://schemas.microsoft.com/office/drawing/2010/main" val="0"/>
+                              </a:ext>
+                              <a:ext uri="{96DAC541-7B7A-43D3-8B79-37D633B846F1}">
+                                <asvg:svgBlip xmlns:asvg="http://schemas.microsoft.com/office/drawing/2016/SVG/main" r:embed="rId10"/>
+                              </a:ext>
+                            </a:extLst>
+                          </a:blip>
+                          <a:stretch>
+                            <a:fillRect/>
+                          </a:stretch>
+                        </pic:blipFill>
+                        <pic:spPr>
+                          <a:xfrm>
+                            <a:off x="0" y="0"/>
+                            <a:ext cx="190500" cy="190500"/>
+                          </a:xfrm>
+                          <a:prstGeom prst="rect">
+                            <a:avLst/>
+                          </a:prstGeom>
+                        </pic:spPr>
+                      </pic:pic>
+                    </a:graphicData>
+                  </a:graphic>
+                </wp:inline>
+              </w:drawing>
+            </w:r>
+          </w:p>
+        </w:tc>
+        <w:tc>
+          <w:tcPr>
+            <w:tcW w:w="1059" w:type="dxa"/>
+          </w:tcPr>
+          <w:p>
+            <w:pPr>
+              <w:cnfStyle w:val="000000000000" w:firstRow="0" w:lastRow="0" w:firstColumn="0" w:lastColumn="0" w:oddVBand="0" w:evenVBand="0" w:oddHBand="0" w:evenHBand="0" w:firstRowFirstColumn="0" w:firstRowLastColumn="0" w:lastRowFirstColumn="0" w:lastRowLastColumn="0"/>
+              <w:rPr>
+                <w:lang w:val="en-GB"/>
+              </w:rPr>
+            </w:pPr>
+          </w:p>
+        </w:tc>
+        <w:tc>
+          <w:tcPr>
+            <w:tcW w:w="1546" w:type="dxa"/>
+          </w:tcPr>
+          <w:p>
+            <w:pPr>
+              <w:cnfStyle w:val="000000000000" w:firstRow="0" w:lastRow="0" w:firstColumn="0" w:lastColumn="0" w:oddVBand="0" w:evenVBand="0" w:oddHBand="0" w:evenHBand="0" w:firstRowFirstColumn="0" w:firstRowLastColumn="0" w:lastRowFirstColumn="0" w:lastRowLastColumn="0"/>
+              <w:rPr>
+                <w:lang w:val="en-GB"/>
+              </w:rPr>
+            </w:pPr>
+          </w:p>
+        </w:tc>
+      </w:tr>
+    </w:tbl>
+    <w:p>
+      <w:pPr>
+        <w:rPr>
+          <w:lang w:val="en-GB"/>
+        </w:rPr>
+      </w:pPr>
+    </w:p>
+    <w:p>
+      <w:pPr>
+        <w:rPr>
+          <w:lang w:val="en-GB"/>
+        </w:rPr>
+      </w:pPr>
+    </w:p>
+    <w:p>
+      <w:pPr>
+        <w:rPr>
+          <w:lang w:val="en-GB"/>
+        </w:rPr>
+      </w:pPr>
+    </w:p>
+    <w:p>
+      <w:pPr>
+        <w:rPr>
+          <w:lang w:val="en-GB"/>
+        </w:rPr>
+      </w:pPr>
+    </w:p>
     <w:sectPr>
       <w:headerReference w:type="default" r:id="rId11"/>
       <w:pgSz w:w="11906" w:h="16838"/>
@@ -5213,7 +6904,7 @@
 </file>
 
 <file path=word/endnotes.xml><?xml version="1.0" encoding="utf-8"?>
-<w:endnotes xmlns:wpc="http://schemas.microsoft.com/office/word/2010/wordprocessingCanvas" xmlns:cx="http://schemas.microsoft.com/office/drawing/2014/chartex" xmlns:cx1="http://schemas.microsoft.com/office/drawing/2015/9/8/chartex" xmlns:cx2="http://schemas.microsoft.com/office/drawing/2015/10/21/chartex" xmlns:cx3="http://schemas.microsoft.com/office/drawing/2016/5/9/chartex" xmlns:cx4="http://schemas.microsoft.com/office/drawing/2016/5/10/chartex" xmlns:cx5="http://schemas.microsoft.com/office/drawing/2016/5/11/chartex" xmlns:cx6="http://schemas.microsoft.com/office/drawing/2016/5/12/chartex" xmlns:cx7="http://schemas.microsoft.com/office/drawing/2016/5/13/chartex" xmlns:cx8="http://schemas.microsoft.com/office/drawing/2016/5/14/chartex" xmlns:mc="http://schemas.openxmlformats.org/markup-compatibility/2006" xmlns:aink="http://schemas.microsoft.com/office/drawing/2016/ink" xmlns:am3d="http://schemas.microsoft.com/office/drawing/2017/model3d" xmlns:o="urn:schemas-microsoft-com:office:office" xmlns:oel="http://schemas.microsoft.com/office/2019/extlst" xmlns:r="http://schemas.openxmlformats.org/officeDocument/2006/relationships" xmlns:m="http://schemas.openxmlformats.org/officeDocument/2006/math" xmlns:v="urn:schemas-microsoft-com:vml" xmlns:wp14="http://schemas.microsoft.com/office/word/2010/wordprocessingDrawing" xmlns:wp="http://schemas.openxmlformats.org/drawingml/2006/wordprocessingDrawing" xmlns:w10="urn:schemas-microsoft-com:office:word" xmlns:w="http://schemas.openxmlformats.org/wordprocessingml/2006/main" xmlns:w14="http://schemas.microsoft.com/office/word/2010/wordml" xmlns:w15="http://schemas.microsoft.com/office/word/2012/wordml" xmlns:w16cex="http://schemas.microsoft.com/office/word/2018/wordml/cex" xmlns:w16cid="http://schemas.microsoft.com/office/word/2016/wordml/cid" xmlns:w16="http://schemas.microsoft.com/office/word/2018/wordml" xmlns:w16du="http://schemas.microsoft.com/office/word/2023/wordml/word16du" xmlns:w16sdtdh="http://schemas.microsoft.com/office/word/2020/wordml/sdtdatahash" xmlns:w16se="http://schemas.microsoft.com/office/word/2015/wordml/symex" xmlns:wpg="http://schemas.microsoft.com/office/word/2010/wordprocessingGroup" xmlns:wpi="http://schemas.microsoft.com/office/word/2010/wordprocessingInk" xmlns:wne="http://schemas.microsoft.com/office/word/2006/wordml" xmlns:wps="http://schemas.microsoft.com/office/word/2010/wordprocessingShape" mc:Ignorable="w14 w15 w16se w16cid w16 w16cex w16sdtdh w16du wp14">
+<w:endnotes xmlns:wpc="http://schemas.microsoft.com/office/word/2010/wordprocessingCanvas" xmlns:cx="http://schemas.microsoft.com/office/drawing/2014/chartex" xmlns:cx1="http://schemas.microsoft.com/office/drawing/2015/9/8/chartex" xmlns:cx2="http://schemas.microsoft.com/office/drawing/2015/10/21/chartex" xmlns:cx3="http://schemas.microsoft.com/office/drawing/2016/5/9/chartex" xmlns:cx4="http://schemas.microsoft.com/office/drawing/2016/5/10/chartex" xmlns:cx5="http://schemas.microsoft.com/office/drawing/2016/5/11/chartex" xmlns:cx6="http://schemas.microsoft.com/office/drawing/2016/5/12/chartex" xmlns:cx7="http://schemas.microsoft.com/office/drawing/2016/5/13/chartex" xmlns:cx8="http://schemas.microsoft.com/office/drawing/2016/5/14/chartex" xmlns:mc="http://schemas.openxmlformats.org/markup-compatibility/2006" xmlns:aink="http://schemas.microsoft.com/office/drawing/2016/ink" xmlns:am3d="http://schemas.microsoft.com/office/drawing/2017/model3d" xmlns:o="urn:schemas-microsoft-com:office:office" xmlns:oel="http://schemas.microsoft.com/office/2019/extlst" xmlns:r="http://schemas.openxmlformats.org/officeDocument/2006/relationships" xmlns:m="http://schemas.openxmlformats.org/officeDocument/2006/math" xmlns:v="urn:schemas-microsoft-com:vml" xmlns:wp14="http://schemas.microsoft.com/office/word/2010/wordprocessingDrawing" xmlns:wp="http://schemas.openxmlformats.org/drawingml/2006/wordprocessingDrawing" xmlns:w10="urn:schemas-microsoft-com:office:word" xmlns:w="http://schemas.openxmlformats.org/wordprocessingml/2006/main" xmlns:w14="http://schemas.microsoft.com/office/word/2010/wordml" xmlns:w15="http://schemas.microsoft.com/office/word/2012/wordml" xmlns:w16cex="http://schemas.microsoft.com/office/word/2018/wordml/cex" xmlns:w16cid="http://schemas.microsoft.com/office/word/2016/wordml/cid" xmlns:w16="http://schemas.microsoft.com/office/word/2018/wordml" xmlns:w16du="http://schemas.microsoft.com/office/word/2023/wordml/word16du" xmlns:w16sdtdh="http://schemas.microsoft.com/office/word/2020/wordml/sdtdatahash" xmlns:w16sdtfl="http://schemas.microsoft.com/office/word/2024/wordml/sdtformatlock" xmlns:w16se="http://schemas.microsoft.com/office/word/2015/wordml/symex" xmlns:wpg="http://schemas.microsoft.com/office/word/2010/wordprocessingGroup" xmlns:wpi="http://schemas.microsoft.com/office/word/2010/wordprocessingInk" xmlns:wne="http://schemas.microsoft.com/office/word/2006/wordml" xmlns:wps="http://schemas.microsoft.com/office/word/2010/wordprocessingShape" mc:Ignorable="w14 w15 w16se w16cid w16 w16cex w16sdtdh w16sdtfl w16du wp14">
   <w:endnote w:type="separator" w:id="-1">
     <w:p>
       <w:pPr>
@@ -5238,7 +6929,7 @@
 </file>
 
 <file path=word/footnotes.xml><?xml version="1.0" encoding="utf-8"?>
-<w:footnotes xmlns:wpc="http://schemas.microsoft.com/office/word/2010/wordprocessingCanvas" xmlns:cx="http://schemas.microsoft.com/office/drawing/2014/chartex" xmlns:cx1="http://schemas.microsoft.com/office/drawing/2015/9/8/chartex" xmlns:cx2="http://schemas.microsoft.com/office/drawing/2015/10/21/chartex" xmlns:cx3="http://schemas.microsoft.com/office/drawing/2016/5/9/chartex" xmlns:cx4="http://schemas.microsoft.com/office/drawing/2016/5/10/chartex" xmlns:cx5="http://schemas.microsoft.com/office/drawing/2016/5/11/chartex" xmlns:cx6="http://schemas.microsoft.com/office/drawing/2016/5/12/chartex" xmlns:cx7="http://schemas.microsoft.com/office/drawing/2016/5/13/chartex" xmlns:cx8="http://schemas.microsoft.com/office/drawing/2016/5/14/chartex" xmlns:mc="http://schemas.openxmlformats.org/markup-compatibility/2006" xmlns:aink="http://schemas.microsoft.com/office/drawing/2016/ink" xmlns:am3d="http://schemas.microsoft.com/office/drawing/2017/model3d" xmlns:o="urn:schemas-microsoft-com:office:office" xmlns:oel="http://schemas.microsoft.com/office/2019/extlst" xmlns:r="http://schemas.openxmlformats.org/officeDocument/2006/relationships" xmlns:m="http://schemas.openxmlformats.org/officeDocument/2006/math" xmlns:v="urn:schemas-microsoft-com:vml" xmlns:wp14="http://schemas.microsoft.com/office/word/2010/wordprocessingDrawing" xmlns:wp="http://schemas.openxmlformats.org/drawingml/2006/wordprocessingDrawing" xmlns:w10="urn:schemas-microsoft-com:office:word" xmlns:w="http://schemas.openxmlformats.org/wordprocessingml/2006/main" xmlns:w14="http://schemas.microsoft.com/office/word/2010/wordml" xmlns:w15="http://schemas.microsoft.com/office/word/2012/wordml" xmlns:w16cex="http://schemas.microsoft.com/office/word/2018/wordml/cex" xmlns:w16cid="http://schemas.microsoft.com/office/word/2016/wordml/cid" xmlns:w16="http://schemas.microsoft.com/office/word/2018/wordml" xmlns:w16du="http://schemas.microsoft.com/office/word/2023/wordml/word16du" xmlns:w16sdtdh="http://schemas.microsoft.com/office/word/2020/wordml/sdtdatahash" xmlns:w16se="http://schemas.microsoft.com/office/word/2015/wordml/symex" xmlns:wpg="http://schemas.microsoft.com/office/word/2010/wordprocessingGroup" xmlns:wpi="http://schemas.microsoft.com/office/word/2010/wordprocessingInk" xmlns:wne="http://schemas.microsoft.com/office/word/2006/wordml" xmlns:wps="http://schemas.microsoft.com/office/word/2010/wordprocessingShape" mc:Ignorable="w14 w15 w16se w16cid w16 w16cex w16sdtdh w16du wp14">
+<w:footnotes xmlns:wpc="http://schemas.microsoft.com/office/word/2010/wordprocessingCanvas" xmlns:cx="http://schemas.microsoft.com/office/drawing/2014/chartex" xmlns:cx1="http://schemas.microsoft.com/office/drawing/2015/9/8/chartex" xmlns:cx2="http://schemas.microsoft.com/office/drawing/2015/10/21/chartex" xmlns:cx3="http://schemas.microsoft.com/office/drawing/2016/5/9/chartex" xmlns:cx4="http://schemas.microsoft.com/office/drawing/2016/5/10/chartex" xmlns:cx5="http://schemas.microsoft.com/office/drawing/2016/5/11/chartex" xmlns:cx6="http://schemas.microsoft.com/office/drawing/2016/5/12/chartex" xmlns:cx7="http://schemas.microsoft.com/office/drawing/2016/5/13/chartex" xmlns:cx8="http://schemas.microsoft.com/office/drawing/2016/5/14/chartex" xmlns:mc="http://schemas.openxmlformats.org/markup-compatibility/2006" xmlns:aink="http://schemas.microsoft.com/office/drawing/2016/ink" xmlns:am3d="http://schemas.microsoft.com/office/drawing/2017/model3d" xmlns:o="urn:schemas-microsoft-com:office:office" xmlns:oel="http://schemas.microsoft.com/office/2019/extlst" xmlns:r="http://schemas.openxmlformats.org/officeDocument/2006/relationships" xmlns:m="http://schemas.openxmlformats.org/officeDocument/2006/math" xmlns:v="urn:schemas-microsoft-com:vml" xmlns:wp14="http://schemas.microsoft.com/office/word/2010/wordprocessingDrawing" xmlns:wp="http://schemas.openxmlformats.org/drawingml/2006/wordprocessingDrawing" xmlns:w10="urn:schemas-microsoft-com:office:word" xmlns:w="http://schemas.openxmlformats.org/wordprocessingml/2006/main" xmlns:w14="http://schemas.microsoft.com/office/word/2010/wordml" xmlns:w15="http://schemas.microsoft.com/office/word/2012/wordml" xmlns:w16cex="http://schemas.microsoft.com/office/word/2018/wordml/cex" xmlns:w16cid="http://schemas.microsoft.com/office/word/2016/wordml/cid" xmlns:w16="http://schemas.microsoft.com/office/word/2018/wordml" xmlns:w16du="http://schemas.microsoft.com/office/word/2023/wordml/word16du" xmlns:w16sdtdh="http://schemas.microsoft.com/office/word/2020/wordml/sdtdatahash" xmlns:w16sdtfl="http://schemas.microsoft.com/office/word/2024/wordml/sdtformatlock" xmlns:w16se="http://schemas.microsoft.com/office/word/2015/wordml/symex" xmlns:wpg="http://schemas.microsoft.com/office/word/2010/wordprocessingGroup" xmlns:wpi="http://schemas.microsoft.com/office/word/2010/wordprocessingInk" xmlns:wne="http://schemas.microsoft.com/office/word/2006/wordml" xmlns:wps="http://schemas.microsoft.com/office/word/2010/wordprocessingShape" mc:Ignorable="w14 w15 w16se w16cid w16 w16cex w16sdtdh w16sdtfl w16du wp14">
   <w:footnote w:type="separator" w:id="-1">
     <w:p>
       <w:pPr>
@@ -5263,10 +6954,10 @@
 </file>
 
 <file path=word/header1.xml><?xml version="1.0" encoding="utf-8"?>
-<w:hdr xmlns:wpc="http://schemas.microsoft.com/office/word/2010/wordprocessingCanvas" xmlns:cx="http://schemas.microsoft.com/office/drawing/2014/chartex" xmlns:cx1="http://schemas.microsoft.com/office/drawing/2015/9/8/chartex" xmlns:cx2="http://schemas.microsoft.com/office/drawing/2015/10/21/chartex" xmlns:cx3="http://schemas.microsoft.com/office/drawing/2016/5/9/chartex" xmlns:cx4="http://schemas.microsoft.com/office/drawing/2016/5/10/chartex" xmlns:cx5="http://schemas.microsoft.com/office/drawing/2016/5/11/chartex" xmlns:cx6="http://schemas.microsoft.com/office/drawing/2016/5/12/chartex" xmlns:cx7="http://schemas.microsoft.com/office/drawing/2016/5/13/chartex" xmlns:cx8="http://schemas.microsoft.com/office/drawing/2016/5/14/chartex" xmlns:mc="http://schemas.openxmlformats.org/markup-compatibility/2006" xmlns:aink="http://schemas.microsoft.com/office/drawing/2016/ink" xmlns:am3d="http://schemas.microsoft.com/office/drawing/2017/model3d" xmlns:o="urn:schemas-microsoft-com:office:office" xmlns:oel="http://schemas.microsoft.com/office/2019/extlst" xmlns:r="http://schemas.openxmlformats.org/officeDocument/2006/relationships" xmlns:m="http://schemas.openxmlformats.org/officeDocument/2006/math" xmlns:v="urn:schemas-microsoft-com:vml" xmlns:wp14="http://schemas.microsoft.com/office/word/2010/wordprocessingDrawing" xmlns:wp="http://schemas.openxmlformats.org/drawingml/2006/wordprocessingDrawing" xmlns:w10="urn:schemas-microsoft-com:office:word" xmlns:w="http://schemas.openxmlformats.org/wordprocessingml/2006/main" xmlns:w14="http://schemas.microsoft.com/office/word/2010/wordml" xmlns:w15="http://schemas.microsoft.com/office/word/2012/wordml" xmlns:w16cex="http://schemas.microsoft.com/office/word/2018/wordml/cex" xmlns:w16cid="http://schemas.microsoft.com/office/word/2016/wordml/cid" xmlns:w16="http://schemas.microsoft.com/office/word/2018/wordml" xmlns:w16du="http://schemas.microsoft.com/office/word/2023/wordml/word16du" xmlns:w16sdtdh="http://schemas.microsoft.com/office/word/2020/wordml/sdtdatahash" xmlns:w16se="http://schemas.microsoft.com/office/word/2015/wordml/symex" xmlns:wpg="http://schemas.microsoft.com/office/word/2010/wordprocessingGroup" xmlns:wpi="http://schemas.microsoft.com/office/word/2010/wordprocessingInk" xmlns:wne="http://schemas.microsoft.com/office/word/2006/wordml" xmlns:wps="http://schemas.microsoft.com/office/word/2010/wordprocessingShape" mc:Ignorable="w14 w15 w16se w16cid w16 w16cex w16sdtdh w16du wp14">
+<w:hdr xmlns:wpc="http://schemas.microsoft.com/office/word/2010/wordprocessingCanvas" xmlns:cx="http://schemas.microsoft.com/office/drawing/2014/chartex" xmlns:cx1="http://schemas.microsoft.com/office/drawing/2015/9/8/chartex" xmlns:cx2="http://schemas.microsoft.com/office/drawing/2015/10/21/chartex" xmlns:cx3="http://schemas.microsoft.com/office/drawing/2016/5/9/chartex" xmlns:cx4="http://schemas.microsoft.com/office/drawing/2016/5/10/chartex" xmlns:cx5="http://schemas.microsoft.com/office/drawing/2016/5/11/chartex" xmlns:cx6="http://schemas.microsoft.com/office/drawing/2016/5/12/chartex" xmlns:cx7="http://schemas.microsoft.com/office/drawing/2016/5/13/chartex" xmlns:cx8="http://schemas.microsoft.com/office/drawing/2016/5/14/chartex" xmlns:mc="http://schemas.openxmlformats.org/markup-compatibility/2006" xmlns:aink="http://schemas.microsoft.com/office/drawing/2016/ink" xmlns:am3d="http://schemas.microsoft.com/office/drawing/2017/model3d" xmlns:o="urn:schemas-microsoft-com:office:office" xmlns:oel="http://schemas.microsoft.com/office/2019/extlst" xmlns:r="http://schemas.openxmlformats.org/officeDocument/2006/relationships" xmlns:m="http://schemas.openxmlformats.org/officeDocument/2006/math" xmlns:v="urn:schemas-microsoft-com:vml" xmlns:wp14="http://schemas.microsoft.com/office/word/2010/wordprocessingDrawing" xmlns:wp="http://schemas.openxmlformats.org/drawingml/2006/wordprocessingDrawing" xmlns:w10="urn:schemas-microsoft-com:office:word" xmlns:w="http://schemas.openxmlformats.org/wordprocessingml/2006/main" xmlns:w14="http://schemas.microsoft.com/office/word/2010/wordml" xmlns:w15="http://schemas.microsoft.com/office/word/2012/wordml" xmlns:w16cex="http://schemas.microsoft.com/office/word/2018/wordml/cex" xmlns:w16cid="http://schemas.microsoft.com/office/word/2016/wordml/cid" xmlns:w16="http://schemas.microsoft.com/office/word/2018/wordml" xmlns:w16du="http://schemas.microsoft.com/office/word/2023/wordml/word16du" xmlns:w16sdtdh="http://schemas.microsoft.com/office/word/2020/wordml/sdtdatahash" xmlns:w16sdtfl="http://schemas.microsoft.com/office/word/2024/wordml/sdtformatlock" xmlns:w16se="http://schemas.microsoft.com/office/word/2015/wordml/symex" xmlns:wpg="http://schemas.microsoft.com/office/word/2010/wordprocessingGroup" xmlns:wpi="http://schemas.microsoft.com/office/word/2010/wordprocessingInk" xmlns:wne="http://schemas.microsoft.com/office/word/2006/wordml" xmlns:wps="http://schemas.microsoft.com/office/word/2010/wordprocessingShape" mc:Ignorable="w14 w15 w16se w16cid w16 w16cex w16sdtdh w16sdtfl w16du wp14">
   <w:p>
     <w:pPr>
-      <w:pStyle w:val="Kopfzeile"/>
+      <w:pStyle w:val="Header"/>
     </w:pPr>
     <w:r>
       <w:t xml:space="preserve">Group 02 </w:t>
@@ -5283,7 +6974,7 @@
 </file>
 
 <file path=word/numbering.xml><?xml version="1.0" encoding="utf-8"?>
-<w:numbering xmlns:wpc="http://schemas.microsoft.com/office/word/2010/wordprocessingCanvas" xmlns:cx="http://schemas.microsoft.com/office/drawing/2014/chartex" xmlns:cx1="http://schemas.microsoft.com/office/drawing/2015/9/8/chartex" xmlns:cx2="http://schemas.microsoft.com/office/drawing/2015/10/21/chartex" xmlns:cx3="http://schemas.microsoft.com/office/drawing/2016/5/9/chartex" xmlns:cx4="http://schemas.microsoft.com/office/drawing/2016/5/10/chartex" xmlns:cx5="http://schemas.microsoft.com/office/drawing/2016/5/11/chartex" xmlns:cx6="http://schemas.microsoft.com/office/drawing/2016/5/12/chartex" xmlns:cx7="http://schemas.microsoft.com/office/drawing/2016/5/13/chartex" xmlns:cx8="http://schemas.microsoft.com/office/drawing/2016/5/14/chartex" xmlns:mc="http://schemas.openxmlformats.org/markup-compatibility/2006" xmlns:aink="http://schemas.microsoft.com/office/drawing/2016/ink" xmlns:am3d="http://schemas.microsoft.com/office/drawing/2017/model3d" xmlns:o="urn:schemas-microsoft-com:office:office" xmlns:oel="http://schemas.microsoft.com/office/2019/extlst" xmlns:r="http://schemas.openxmlformats.org/officeDocument/2006/relationships" xmlns:m="http://schemas.openxmlformats.org/officeDocument/2006/math" xmlns:v="urn:schemas-microsoft-com:vml" xmlns:wp14="http://schemas.microsoft.com/office/word/2010/wordprocessingDrawing" xmlns:wp="http://schemas.openxmlformats.org/drawingml/2006/wordprocessingDrawing" xmlns:w10="urn:schemas-microsoft-com:office:word" xmlns:w="http://schemas.openxmlformats.org/wordprocessingml/2006/main" xmlns:w14="http://schemas.microsoft.com/office/word/2010/wordml" xmlns:w15="http://schemas.microsoft.com/office/word/2012/wordml" xmlns:w16cex="http://schemas.microsoft.com/office/word/2018/wordml/cex" xmlns:w16cid="http://schemas.microsoft.com/office/word/2016/wordml/cid" xmlns:w16="http://schemas.microsoft.com/office/word/2018/wordml" xmlns:w16du="http://schemas.microsoft.com/office/word/2023/wordml/word16du" xmlns:w16sdtdh="http://schemas.microsoft.com/office/word/2020/wordml/sdtdatahash" xmlns:w16se="http://schemas.microsoft.com/office/word/2015/wordml/symex" xmlns:wpg="http://schemas.microsoft.com/office/word/2010/wordprocessingGroup" xmlns:wpi="http://schemas.microsoft.com/office/word/2010/wordprocessingInk" xmlns:wne="http://schemas.microsoft.com/office/word/2006/wordml" xmlns:wps="http://schemas.microsoft.com/office/word/2010/wordprocessingShape" mc:Ignorable="w14 w15 w16se w16cid w16 w16cex w16sdtdh w16du wp14">
+<w:numbering xmlns:wpc="http://schemas.microsoft.com/office/word/2010/wordprocessingCanvas" xmlns:cx="http://schemas.microsoft.com/office/drawing/2014/chartex" xmlns:cx1="http://schemas.microsoft.com/office/drawing/2015/9/8/chartex" xmlns:cx2="http://schemas.microsoft.com/office/drawing/2015/10/21/chartex" xmlns:cx3="http://schemas.microsoft.com/office/drawing/2016/5/9/chartex" xmlns:cx4="http://schemas.microsoft.com/office/drawing/2016/5/10/chartex" xmlns:cx5="http://schemas.microsoft.com/office/drawing/2016/5/11/chartex" xmlns:cx6="http://schemas.microsoft.com/office/drawing/2016/5/12/chartex" xmlns:cx7="http://schemas.microsoft.com/office/drawing/2016/5/13/chartex" xmlns:cx8="http://schemas.microsoft.com/office/drawing/2016/5/14/chartex" xmlns:mc="http://schemas.openxmlformats.org/markup-compatibility/2006" xmlns:aink="http://schemas.microsoft.com/office/drawing/2016/ink" xmlns:am3d="http://schemas.microsoft.com/office/drawing/2017/model3d" xmlns:o="urn:schemas-microsoft-com:office:office" xmlns:oel="http://schemas.microsoft.com/office/2019/extlst" xmlns:r="http://schemas.openxmlformats.org/officeDocument/2006/relationships" xmlns:m="http://schemas.openxmlformats.org/officeDocument/2006/math" xmlns:v="urn:schemas-microsoft-com:vml" xmlns:wp14="http://schemas.microsoft.com/office/word/2010/wordprocessingDrawing" xmlns:wp="http://schemas.openxmlformats.org/drawingml/2006/wordprocessingDrawing" xmlns:w10="urn:schemas-microsoft-com:office:word" xmlns:w="http://schemas.openxmlformats.org/wordprocessingml/2006/main" xmlns:w14="http://schemas.microsoft.com/office/word/2010/wordml" xmlns:w15="http://schemas.microsoft.com/office/word/2012/wordml" xmlns:w16cex="http://schemas.microsoft.com/office/word/2018/wordml/cex" xmlns:w16cid="http://schemas.microsoft.com/office/word/2016/wordml/cid" xmlns:w16="http://schemas.microsoft.com/office/word/2018/wordml" xmlns:w16du="http://schemas.microsoft.com/office/word/2023/wordml/word16du" xmlns:w16sdtdh="http://schemas.microsoft.com/office/word/2020/wordml/sdtdatahash" xmlns:w16sdtfl="http://schemas.microsoft.com/office/word/2024/wordml/sdtformatlock" xmlns:w16se="http://schemas.microsoft.com/office/word/2015/wordml/symex" xmlns:wpg="http://schemas.microsoft.com/office/word/2010/wordprocessingGroup" xmlns:wpi="http://schemas.microsoft.com/office/word/2010/wordprocessingInk" xmlns:wne="http://schemas.microsoft.com/office/word/2006/wordml" xmlns:wps="http://schemas.microsoft.com/office/word/2010/wordprocessingShape" mc:Ignorable="w14 w15 w16se w16cid w16 w16cex w16sdtdh w16sdtfl w16du wp14">
   <w:abstractNum w:abstractNumId="0" w15:restartNumberingAfterBreak="0">
     <w:nsid w:val="671F513E"/>
     <w:multiLevelType w:val="hybridMultilevel"/>
@@ -5404,7 +7095,7 @@
 </file>
 
 <file path=word/styles.xml><?xml version="1.0" encoding="utf-8"?>
-<w:styles xmlns:mc="http://schemas.openxmlformats.org/markup-compatibility/2006" xmlns:r="http://schemas.openxmlformats.org/officeDocument/2006/relationships" xmlns:w="http://schemas.openxmlformats.org/wordprocessingml/2006/main" xmlns:w14="http://schemas.microsoft.com/office/word/2010/wordml" xmlns:w15="http://schemas.microsoft.com/office/word/2012/wordml" xmlns:w16cex="http://schemas.microsoft.com/office/word/2018/wordml/cex" xmlns:w16cid="http://schemas.microsoft.com/office/word/2016/wordml/cid" xmlns:w16="http://schemas.microsoft.com/office/word/2018/wordml" xmlns:w16du="http://schemas.microsoft.com/office/word/2023/wordml/word16du" xmlns:w16sdtdh="http://schemas.microsoft.com/office/word/2020/wordml/sdtdatahash" xmlns:w16se="http://schemas.microsoft.com/office/word/2015/wordml/symex" mc:Ignorable="w14 w15 w16se w16cid w16 w16cex w16sdtdh w16du">
+<w:styles xmlns:mc="http://schemas.openxmlformats.org/markup-compatibility/2006" xmlns:r="http://schemas.openxmlformats.org/officeDocument/2006/relationships" xmlns:w="http://schemas.openxmlformats.org/wordprocessingml/2006/main" xmlns:w14="http://schemas.microsoft.com/office/word/2010/wordml" xmlns:w15="http://schemas.microsoft.com/office/word/2012/wordml" xmlns:w16cex="http://schemas.microsoft.com/office/word/2018/wordml/cex" xmlns:w16cid="http://schemas.microsoft.com/office/word/2016/wordml/cid" xmlns:w16="http://schemas.microsoft.com/office/word/2018/wordml" xmlns:w16du="http://schemas.microsoft.com/office/word/2023/wordml/word16du" xmlns:w16sdtdh="http://schemas.microsoft.com/office/word/2020/wordml/sdtdatahash" xmlns:w16sdtfl="http://schemas.microsoft.com/office/word/2024/wordml/sdtformatlock" xmlns:w16se="http://schemas.microsoft.com/office/word/2015/wordml/symex" mc:Ignorable="w14 w15 w16se w16cid w16 w16cex w16sdtdh w16sdtfl w16du">
   <w:docDefaults>
     <w:rPrDefault>
       <w:rPr>
@@ -5800,15 +7491,16 @@
     <w:lsdException w:name="Unresolved Mention" w:semiHidden="1" w:unhideWhenUsed="1"/>
     <w:lsdException w:name="Smart Link" w:semiHidden="1" w:unhideWhenUsed="1"/>
   </w:latentStyles>
-  <w:style w:type="paragraph" w:default="1" w:styleId="Standard">
+  <w:style w:type="paragraph" w:default="1" w:styleId="Normal">
     <w:name w:val="Normal"/>
     <w:qFormat/>
+    <w:rsid w:val="00035AB3"/>
   </w:style>
-  <w:style w:type="paragraph" w:styleId="berschrift1">
+  <w:style w:type="paragraph" w:styleId="Heading1">
     <w:name w:val="heading 1"/>
-    <w:basedOn w:val="Standard"/>
-    <w:next w:val="Standard"/>
-    <w:link w:val="berschrift1Zchn"/>
+    <w:basedOn w:val="Normal"/>
+    <w:next w:val="Normal"/>
+    <w:link w:val="Heading1Char"/>
     <w:uiPriority w:val="9"/>
     <w:qFormat/>
     <w:rsid w:val="00DC38C3"/>
@@ -5825,11 +7517,11 @@
       <w:szCs w:val="32"/>
     </w:rPr>
   </w:style>
-  <w:style w:type="paragraph" w:styleId="berschrift2">
+  <w:style w:type="paragraph" w:styleId="Heading2">
     <w:name w:val="heading 2"/>
-    <w:basedOn w:val="Standard"/>
-    <w:next w:val="Standard"/>
-    <w:link w:val="berschrift2Zchn"/>
+    <w:basedOn w:val="Normal"/>
+    <w:next w:val="Normal"/>
+    <w:link w:val="Heading2Char"/>
     <w:uiPriority w:val="9"/>
     <w:unhideWhenUsed/>
     <w:qFormat/>
@@ -5847,11 +7539,11 @@
       <w:szCs w:val="26"/>
     </w:rPr>
   </w:style>
-  <w:style w:type="paragraph" w:styleId="berschrift3">
+  <w:style w:type="paragraph" w:styleId="Heading3">
     <w:name w:val="heading 3"/>
-    <w:basedOn w:val="Standard"/>
-    <w:next w:val="Standard"/>
-    <w:link w:val="berschrift3Zchn"/>
+    <w:basedOn w:val="Normal"/>
+    <w:next w:val="Normal"/>
+    <w:link w:val="Heading3Char"/>
     <w:uiPriority w:val="9"/>
     <w:unhideWhenUsed/>
     <w:qFormat/>
@@ -5869,13 +7561,13 @@
       <w:szCs w:val="24"/>
     </w:rPr>
   </w:style>
-  <w:style w:type="character" w:default="1" w:styleId="Absatz-Standardschriftart">
+  <w:style w:type="character" w:default="1" w:styleId="DefaultParagraphFont">
     <w:name w:val="Default Paragraph Font"/>
     <w:uiPriority w:val="1"/>
     <w:semiHidden/>
     <w:unhideWhenUsed/>
   </w:style>
-  <w:style w:type="table" w:default="1" w:styleId="NormaleTabelle">
+  <w:style w:type="table" w:default="1" w:styleId="TableNormal">
     <w:name w:val="Normal Table"/>
     <w:uiPriority w:val="99"/>
     <w:semiHidden/>
@@ -5890,16 +7582,16 @@
       </w:tblCellMar>
     </w:tblPr>
   </w:style>
-  <w:style w:type="numbering" w:default="1" w:styleId="KeineListe">
+  <w:style w:type="numbering" w:default="1" w:styleId="NoList">
     <w:name w:val="No List"/>
     <w:uiPriority w:val="99"/>
     <w:semiHidden/>
     <w:unhideWhenUsed/>
   </w:style>
-  <w:style w:type="paragraph" w:styleId="Kopfzeile">
+  <w:style w:type="paragraph" w:styleId="Header">
     <w:name w:val="header"/>
-    <w:basedOn w:val="Standard"/>
-    <w:link w:val="KopfzeileZchn"/>
+    <w:basedOn w:val="Normal"/>
+    <w:link w:val="HeaderChar"/>
     <w:uiPriority w:val="99"/>
     <w:unhideWhenUsed/>
     <w:rsid w:val="00DC38C3"/>
@@ -5911,17 +7603,17 @@
       <w:spacing w:after="0" w:line="240" w:lineRule="auto"/>
     </w:pPr>
   </w:style>
-  <w:style w:type="character" w:customStyle="1" w:styleId="KopfzeileZchn">
-    <w:name w:val="Kopfzeile Zchn"/>
-    <w:basedOn w:val="Absatz-Standardschriftart"/>
-    <w:link w:val="Kopfzeile"/>
+  <w:style w:type="character" w:customStyle="1" w:styleId="HeaderChar">
+    <w:name w:val="Header Char"/>
+    <w:basedOn w:val="DefaultParagraphFont"/>
+    <w:link w:val="Header"/>
     <w:uiPriority w:val="99"/>
     <w:rsid w:val="00DC38C3"/>
   </w:style>
-  <w:style w:type="paragraph" w:styleId="Fuzeile">
+  <w:style w:type="paragraph" w:styleId="Footer">
     <w:name w:val="footer"/>
-    <w:basedOn w:val="Standard"/>
-    <w:link w:val="FuzeileZchn"/>
+    <w:basedOn w:val="Normal"/>
+    <w:link w:val="FooterChar"/>
     <w:uiPriority w:val="99"/>
     <w:unhideWhenUsed/>
     <w:rsid w:val="00DC38C3"/>
@@ -5933,14 +7625,14 @@
       <w:spacing w:after="0" w:line="240" w:lineRule="auto"/>
     </w:pPr>
   </w:style>
-  <w:style w:type="character" w:customStyle="1" w:styleId="FuzeileZchn">
-    <w:name w:val="Fußzeile Zchn"/>
-    <w:basedOn w:val="Absatz-Standardschriftart"/>
-    <w:link w:val="Fuzeile"/>
+  <w:style w:type="character" w:customStyle="1" w:styleId="FooterChar">
+    <w:name w:val="Footer Char"/>
+    <w:basedOn w:val="DefaultParagraphFont"/>
+    <w:link w:val="Footer"/>
     <w:uiPriority w:val="99"/>
     <w:rsid w:val="00DC38C3"/>
   </w:style>
-  <w:style w:type="paragraph" w:styleId="KeinLeerraum">
+  <w:style w:type="paragraph" w:styleId="NoSpacing">
     <w:name w:val="No Spacing"/>
     <w:uiPriority w:val="1"/>
     <w:qFormat/>
@@ -5949,10 +7641,10 @@
       <w:spacing w:after="0" w:line="240" w:lineRule="auto"/>
     </w:pPr>
   </w:style>
-  <w:style w:type="character" w:customStyle="1" w:styleId="berschrift1Zchn">
-    <w:name w:val="Überschrift 1 Zchn"/>
-    <w:basedOn w:val="Absatz-Standardschriftart"/>
-    <w:link w:val="berschrift1"/>
+  <w:style w:type="character" w:customStyle="1" w:styleId="Heading1Char">
+    <w:name w:val="Heading 1 Char"/>
+    <w:basedOn w:val="DefaultParagraphFont"/>
+    <w:link w:val="Heading1"/>
     <w:uiPriority w:val="9"/>
     <w:rsid w:val="00DC38C3"/>
     <w:rPr>
@@ -5964,7 +7656,7 @@
   </w:style>
   <w:style w:type="character" w:styleId="Hyperlink">
     <w:name w:val="Hyperlink"/>
-    <w:basedOn w:val="Absatz-Standardschriftart"/>
+    <w:basedOn w:val="DefaultParagraphFont"/>
     <w:uiPriority w:val="99"/>
     <w:unhideWhenUsed/>
     <w:rsid w:val="00DC38C3"/>
@@ -5973,10 +7665,10 @@
       <w:u w:val="single"/>
     </w:rPr>
   </w:style>
-  <w:style w:type="character" w:customStyle="1" w:styleId="berschrift2Zchn">
-    <w:name w:val="Überschrift 2 Zchn"/>
-    <w:basedOn w:val="Absatz-Standardschriftart"/>
-    <w:link w:val="berschrift2"/>
+  <w:style w:type="character" w:customStyle="1" w:styleId="Heading2Char">
+    <w:name w:val="Heading 2 Char"/>
+    <w:basedOn w:val="DefaultParagraphFont"/>
+    <w:link w:val="Heading2"/>
     <w:uiPriority w:val="9"/>
     <w:rsid w:val="00DC38C3"/>
     <w:rPr>
@@ -5986,10 +7678,10 @@
       <w:szCs w:val="26"/>
     </w:rPr>
   </w:style>
-  <w:style w:type="character" w:customStyle="1" w:styleId="berschrift3Zchn">
-    <w:name w:val="Überschrift 3 Zchn"/>
-    <w:basedOn w:val="Absatz-Standardschriftart"/>
-    <w:link w:val="berschrift3"/>
+  <w:style w:type="character" w:customStyle="1" w:styleId="Heading3Char">
+    <w:name w:val="Heading 3 Char"/>
+    <w:basedOn w:val="DefaultParagraphFont"/>
+    <w:link w:val="Heading3"/>
     <w:uiPriority w:val="9"/>
     <w:rsid w:val="00DC38C3"/>
     <w:rPr>
@@ -5999,9 +7691,9 @@
       <w:szCs w:val="24"/>
     </w:rPr>
   </w:style>
-  <w:style w:type="paragraph" w:styleId="Listenabsatz">
+  <w:style w:type="paragraph" w:styleId="ListParagraph">
     <w:name w:val="List Paragraph"/>
-    <w:basedOn w:val="Standard"/>
+    <w:basedOn w:val="Normal"/>
     <w:uiPriority w:val="34"/>
     <w:qFormat/>
     <w:rsid w:val="00D271A6"/>
@@ -6010,10 +7702,10 @@
       <w:contextualSpacing/>
     </w:pPr>
   </w:style>
-  <w:style w:type="paragraph" w:styleId="Inhaltsverzeichnisberschrift">
+  <w:style w:type="paragraph" w:styleId="TOCHeading">
     <w:name w:val="TOC Heading"/>
-    <w:basedOn w:val="berschrift1"/>
-    <w:next w:val="Standard"/>
+    <w:basedOn w:val="Heading1"/>
+    <w:next w:val="Normal"/>
     <w:uiPriority w:val="39"/>
     <w:unhideWhenUsed/>
     <w:qFormat/>
@@ -6027,10 +7719,10 @@
       <w14:ligatures w14:val="none"/>
     </w:rPr>
   </w:style>
-  <w:style w:type="paragraph" w:styleId="Verzeichnis2">
+  <w:style w:type="paragraph" w:styleId="TOC2">
     <w:name w:val="toc 2"/>
-    <w:basedOn w:val="Standard"/>
-    <w:next w:val="Standard"/>
+    <w:basedOn w:val="Normal"/>
+    <w:next w:val="Normal"/>
     <w:autoRedefine/>
     <w:uiPriority w:val="39"/>
     <w:unhideWhenUsed/>
@@ -6040,10 +7732,10 @@
       <w:ind w:left="220"/>
     </w:pPr>
   </w:style>
-  <w:style w:type="paragraph" w:styleId="Verzeichnis1">
+  <w:style w:type="paragraph" w:styleId="TOC1">
     <w:name w:val="toc 1"/>
-    <w:basedOn w:val="Standard"/>
-    <w:next w:val="Standard"/>
+    <w:basedOn w:val="Normal"/>
+    <w:next w:val="Normal"/>
     <w:autoRedefine/>
     <w:uiPriority w:val="39"/>
     <w:unhideWhenUsed/>
@@ -6052,10 +7744,10 @@
       <w:spacing w:after="100"/>
     </w:pPr>
   </w:style>
-  <w:style w:type="paragraph" w:styleId="Beschriftung">
+  <w:style w:type="paragraph" w:styleId="Caption">
     <w:name w:val="caption"/>
-    <w:basedOn w:val="Standard"/>
-    <w:next w:val="Standard"/>
+    <w:basedOn w:val="Normal"/>
+    <w:next w:val="Normal"/>
     <w:uiPriority w:val="35"/>
     <w:unhideWhenUsed/>
     <w:qFormat/>
@@ -6071,9 +7763,9 @@
       <w:szCs w:val="18"/>
     </w:rPr>
   </w:style>
-  <w:style w:type="paragraph" w:styleId="StandardWeb">
+  <w:style w:type="paragraph" w:styleId="NormalWeb">
     <w:name w:val="Normal (Web)"/>
-    <w:basedOn w:val="Standard"/>
+    <w:basedOn w:val="Normal"/>
     <w:uiPriority w:val="99"/>
     <w:semiHidden/>
     <w:unhideWhenUsed/>
@@ -6090,9 +7782,9 @@
       <w14:ligatures w14:val="none"/>
     </w:rPr>
   </w:style>
-  <w:style w:type="table" w:styleId="Tabellenraster">
+  <w:style w:type="table" w:styleId="TableGrid">
     <w:name w:val="Table Grid"/>
-    <w:basedOn w:val="NormaleTabelle"/>
+    <w:basedOn w:val="TableNormal"/>
     <w:uiPriority w:val="39"/>
     <w:rsid w:val="00C10CC9"/>
     <w:pPr>
@@ -6109,9 +7801,9 @@
       </w:tblBorders>
     </w:tblPr>
   </w:style>
-  <w:style w:type="table" w:styleId="EinfacheTabelle3">
+  <w:style w:type="table" w:styleId="PlainTable3">
     <w:name w:val="Plain Table 3"/>
-    <w:basedOn w:val="NormaleTabelle"/>
+    <w:basedOn w:val="TableNormal"/>
     <w:uiPriority w:val="43"/>
     <w:rsid w:val="00C10CC9"/>
     <w:pPr>
@@ -6202,9 +7894,9 @@
       </w:tcPr>
     </w:tblStylePr>
   </w:style>
-  <w:style w:type="character" w:styleId="NichtaufgelsteErwhnung">
+  <w:style w:type="character" w:styleId="UnresolvedMention">
     <w:name w:val="Unresolved Mention"/>
-    <w:basedOn w:val="Absatz-Standardschriftart"/>
+    <w:basedOn w:val="DefaultParagraphFont"/>
     <w:uiPriority w:val="99"/>
     <w:semiHidden/>
     <w:unhideWhenUsed/>

</xml_diff>